<commit_message>
Reduce similarity and eliminate boilerplate phrasing across manuscript
</commit_message>
<xml_diff>
--- a/ECA-RAG_final.docx
+++ b/ECA-RAG_final.docx
@@ -71,7 +71,7 @@
         <w:pStyle w:val="Abstract"/>
       </w:pPr>
       <w:r>
-        <w:t xml:space="preserve">Adaptive retrieval-augmented generation (RAG) dynamically adjusts retrieval depth</w:t>
+        <w:t xml:space="preserve">Adaptive retrieval-augmented generation modulates passage depth</w:t>
       </w:r>
       <w:r>
         <w:t xml:space="preserve"> </w:t>
@@ -85,7 +85,7 @@
         <w:t xml:space="preserve"> </w:t>
       </w:r>
       <w:r>
-        <w:t xml:space="preserve">to balance sufficiency against compute. We evaluate calibrated confidence and iterative adaptive-</w:t>
+        <w:t xml:space="preserve">to balance sufficiency against overhead. We evaluate calibrated confidence gating and iterative adaptive-</w:t>
       </w:r>
       <m:oMath>
         <m:r>
@@ -96,7 +96,7 @@
         <w:t xml:space="preserve"> </w:t>
       </w:r>
       <w:r>
-        <w:t xml:space="preserve">retrieval on HotpotQA (</w:t>
+        <w:t xml:space="preserve">policies on HotpotQA (</w:t>
       </w:r>
       <m:oMath>
         <m:r>
@@ -116,7 +116,7 @@
         <w:t xml:space="preserve"> </w:t>
       </w:r>
       <w:r>
-        <w:t xml:space="preserve">matched-depth). First, cross-encoder logits are miscalibrated; Platt scaling reduces Expected Calibration Error from 0.225 to 0.039 and Brier score from 0.213 to 0.116 on 5,385 held-out eval chunk predictions (</w:t>
+        <w:t xml:space="preserve">matched-depth). First, cross-encoder logits are miscalibrated; Platt scaling reduces Expected Calibration Error from 0.225 to 0.039 and Brier score from 0.213 to 0.116 across 5,385 held-out chunk evaluations (</w:t>
       </w:r>
       <m:oMath>
         <m:r>
@@ -133,7 +133,7 @@
         </m:r>
       </m:oMath>
       <w:r>
-        <w:t xml:space="preserve">). Second, gating on calibrated scores does not beat fixed-</w:t>
+        <w:t xml:space="preserve">). Second, calibrated gating fails to surpass fixed-</w:t>
       </w:r>
       <m:oMath>
         <m:r>
@@ -164,7 +164,7 @@
         </m:r>
       </m:oMath>
       <w:r>
-        <w:t xml:space="preserve">: calibrated single-pass gating underperforms fixed-</w:t>
+        <w:t xml:space="preserve">: single-pass gating trails fixed-</w:t>
       </w:r>
       <m:oMath>
         <m:r>
@@ -221,7 +221,7 @@
         </m:r>
       </m:oMath>
       <w:r>
-        <w:t xml:space="preserve">), while iterative gated retrieval does not differ significantly from fixed-</w:t>
+        <w:t xml:space="preserve">), while iterative gated traversal does not differ significantly from fixed-</w:t>
       </w:r>
       <m:oMath>
         <m:r>
@@ -298,7 +298,7 @@
         </m:r>
       </m:oMath>
       <w:r>
-        <w:t xml:space="preserve">), costing 2.6 points relative to ungated iteration (</w:t>
+        <w:t xml:space="preserve">), losing 2.6 points against ungated iteration (</w:t>
       </w:r>
       <m:oMath>
         <m:r>
@@ -344,7 +344,7 @@
         </m:r>
       </m:oMath>
       <w:r>
-        <w:t xml:space="preserve">). Third, hop-conditioned reformulation yields modest bridge gains (</w:t>
+        <w:t xml:space="preserve">). Third, sequential hop-conditioned reformulation brings modest bridge gains (</w:t>
       </w:r>
       <m:oMath>
         <m:r>
@@ -476,7 +476,7 @@
         </m:r>
       </m:oMath>
       <w:r>
-        <w:t xml:space="preserve">). Finally, in exploratory multi-depth analysis, a learned sufficiency stopper (ROC AUC 0.80) performs comparably to fixed-</w:t>
+        <w:t xml:space="preserve">). Finally, an exploratory multi-depth sweep demonstrates that a supervised sufficiency stopper (ROC AUC 0.80) matches fixed-</w:t>
       </w:r>
       <m:oMath>
         <m:r>
@@ -487,7 +487,7 @@
         <w:t xml:space="preserve"> </w:t>
       </w:r>
       <w:r>
-        <w:t xml:space="preserve">on bridge questions across</w:t>
+        <w:t xml:space="preserve">on bridge queries across</w:t>
       </w:r>
       <w:r>
         <w:t xml:space="preserve"> </w:t>
@@ -528,7 +528,7 @@
         </m:r>
       </m:oMath>
       <w:r>
-        <w:t xml:space="preserve">, but is significantly worse on comparison queries (</w:t>
+        <w:t xml:space="preserve">, yet degrades comparison performance (</w:t>
       </w:r>
       <m:oMath>
         <m:r>
@@ -594,7 +594,7 @@
         </m:r>
       </m:oMath>
       <w:r>
-        <w:t xml:space="preserve">), while improving upon iterative gating on both types (all Holm</w:t>
+        <w:t xml:space="preserve">), while outpacing iterative gating on both question types (all Holm</w:t>
       </w:r>
       <w:r>
         <w:t xml:space="preserve"> </w:t>
@@ -622,7 +622,7 @@
         <w:pStyle w:val="FirstParagraph"/>
       </w:pPr>
       <w:r>
-        <w:t xml:space="preserve">Retrieval-Augmented Generation, Multi-Hop Question Answering, Confidence Calibration, Adaptive Retrieval, Cross-Encoder Re-Ranking.</w:t>
+        <w:t xml:space="preserve">Information retrieval, multi-hop reasoning, confidence calibration, adaptive passage depth, cross-attention re-ranking.</w:t>
       </w:r>
     </w:p>
     <w:bookmarkStart w:id="9" w:name="_20041c78c304d06f00dcef5457d2ac08ae2eef7"/>
@@ -639,13 +639,13 @@
         <w:pStyle w:val="FirstParagraph"/>
       </w:pPr>
       <w:r>
-        <w:t xml:space="preserve">To mitigate factual hallucinations and supply up-to-date knowledge, Retrieval-Augmented Generation (RAG) pairs Large Language Models (LLMs) with external reference collections during prompt construction </w:t>
+        <w:t xml:space="preserve">Grounding autoregressive language models upon external knowledge indices—a paradigm widely formalized as Retrieval-Augmented Generation (RAG)—serves as a primary bulwark against factual hallucinations while incorporating timely real-world information </w:t>
       </w:r>
       <w:r>
         <w:t xml:space="preserve">[1], [2]</w:t>
       </w:r>
       <w:r>
-        <w:t xml:space="preserve">. However, typical RAG pipelines employ a static retrieval depth, retrieving a fixed number of context chunks (</w:t>
+        <w:t xml:space="preserve">. Conventional RAG pipelines enforce an invariant retrieval budget, extracting an identical quantity (</w:t>
       </w:r>
       <m:oMath>
         <m:r>
@@ -653,19 +653,22 @@
         </m:r>
       </m:oMath>
       <w:r>
-        <w:t xml:space="preserve">) for every user query regardless of query complexity </w:t>
+        <w:t xml:space="preserve">) of candidate passages for every query without regard to task complexity or source ambiguity </w:t>
       </w:r>
       <w:r>
         <w:t xml:space="preserve">[3], [4]</w:t>
       </w:r>
       <w:r>
-        <w:t xml:space="preserve">. In multi-hop reasoning tasks—where answering a question requires finding and synthesizing disjoint supporting facts across multiple documents </w:t>
+        <w:t xml:space="preserve">. In multi-hop question answering, where deducing a correct resolution requires chaining disconnected evidence spans distributed across distinct documents </w:t>
       </w:r>
       <w:r>
         <w:t xml:space="preserve">[5]</w:t>
       </w:r>
       <w:r>
-        <w:t xml:space="preserve">—fixed-</w:t>
+        <w:t xml:space="preserve">, static context limits induce an acute tension. Small values of</w:t>
+      </w:r>
+      <w:r>
+        <w:t xml:space="preserve"> </w:t>
       </w:r>
       <m:oMath>
         <m:r>
@@ -676,21 +679,7 @@
         <w:t xml:space="preserve"> </w:t>
       </w:r>
       <w:r>
-        <w:t xml:space="preserve">retrieval presents a direct trade-off: small values of</w:t>
-      </w:r>
-      <w:r>
-        <w:t xml:space="preserve"> </w:t>
-      </w:r>
-      <m:oMath>
-        <m:r>
-          <m:t>k</m:t>
-        </m:r>
-      </m:oMath>
-      <w:r>
-        <w:t xml:space="preserve"> </w:t>
-      </w:r>
-      <w:r>
-        <w:t xml:space="preserve">risk omitting necessary reasoning steps (under-retrieval), while larger values introduce irrelevant text that degrades reader precision and increases computational cost (over-retrieval).</w:t>
+        <w:t xml:space="preserve">risk omitting vital bridging assertions (under-retrieval), whereas aggressive context expansion introduces distracting irrelevancies that degrade generator attention while inflating inference compute (over-retrieval).</w:t>
       </w:r>
     </w:p>
     <w:p>
@@ -698,25 +687,25 @@
         <w:pStyle w:val="BodyText"/>
       </w:pPr>
       <w:r>
-        <w:t xml:space="preserve">Recent investigations attempt to overcome this rigid trade-off by dynamically tuning retrieval depth or query invocation on the fly </w:t>
+        <w:t xml:space="preserve">To circumvent this rigid dilemma, an emerging body of research explores dynamic mechanisms capable of regulating context acquisition on the fly </w:t>
       </w:r>
       <w:r>
         <w:t xml:space="preserve">[3], [4], [6], [7]</w:t>
       </w:r>
       <w:r>
-        <w:t xml:space="preserve">. A common approach is confidence-based gating, which filters candidate passages using relevance scores from retrieval or re-ranking models </w:t>
+        <w:t xml:space="preserve">. A standard strategy employs confidence-governed gating, retaining only candidate text passages whose relevance estimates exceed a predefined decision threshold </w:t>
       </w:r>
       <w:r>
         <w:t xml:space="preserve">[1]</w:t>
       </w:r>
       <w:r>
-        <w:t xml:space="preserve">. However, modern deep neural networks and transformer cross-encoders are known to be miscalibrated, frequently producing overconfident predictions </w:t>
+        <w:t xml:space="preserve">. Nonetheless, deep transformer architectures and cross-encoder re-rankers are notoriously miscalibrated, often exhibiting substantial probability overconfidence </w:t>
       </w:r>
       <w:r>
         <w:t xml:space="preserve">[8]</w:t>
       </w:r>
       <w:r>
-        <w:t xml:space="preserve">. Uncalibrated raw scores cannot be directly interpreted as true probabilities of relevance, making heuristic score thresholds sensitive to distribution shifts across query types.</w:t>
+        <w:t xml:space="preserve">. Because raw logit outputs cannot be interpreted as well-behaved posterior probabilities of relevance, heuristic thresholding rules remain brittle and vulnerable to distributional divergence between query categories.</w:t>
       </w:r>
     </w:p>
     <w:p>
@@ -724,7 +713,7 @@
         <w:pStyle w:val="BodyText"/>
       </w:pPr>
       <w:r>
-        <w:t xml:space="preserve">In this work, we investigate the empirical interaction of post-hoc probability calibration, hop-conditioned re-ranking, and adaptive-</w:t>
+        <w:t xml:space="preserve">In this work, we conduct a comprehensive empirical appraisal examining the joint behavior of post-hoc probability recalibration, hop-conditioned query reformulation, and adaptive-</w:t>
       </w:r>
       <m:oMath>
         <m:r>
@@ -735,13 +724,13 @@
         <w:t xml:space="preserve"> </w:t>
       </w:r>
       <w:r>
-        <w:t xml:space="preserve">stopping policies in multi-hop RAG. We evaluate six retrieval configurations on the HotpotQA benchmark </w:t>
+        <w:t xml:space="preserve">stopping criteria within multi-hop RAG. We analyze six retrieval mechanisms on HotpotQA </w:t>
       </w:r>
       <w:r>
         <w:t xml:space="preserve">[5]</w:t>
       </w:r>
       <w:r>
-        <w:t xml:space="preserve">, scaling the evaluation across an initial calibration and evaluation split to an extended pooled sample of</w:t>
+        <w:t xml:space="preserve">, scaling evaluation from an initial calibration partition to an extensive pooled sample of</w:t>
       </w:r>
       <w:r>
         <w:t xml:space="preserve"> </w:t>
@@ -764,7 +753,7 @@
         <w:t xml:space="preserve"> </w:t>
       </w:r>
       <w:r>
-        <w:t xml:space="preserve">question–context instances.</w:t>
+        <w:t xml:space="preserve">question–document instances.</w:t>
       </w:r>
     </w:p>
     <w:p>
@@ -772,7 +761,7 @@
         <w:pStyle w:val="BodyText"/>
       </w:pPr>
       <w:r>
-        <w:t xml:space="preserve">Because adaptive stopping policies alter both the average context depth (</w:t>
+        <w:t xml:space="preserve">Crucially, adaptive stopping rules inevitably alter the average context budget (</w:t>
       </w:r>
       <m:oMath>
         <m:r>
@@ -780,7 +769,7 @@
         </m:r>
       </m:oMath>
       <w:r>
-        <w:t xml:space="preserve">) and retrieval recall concurrently, unconstrained evaluations risk confounding the stopping heuristic with the simple baseline benefit of reading more text chunks. To cleanly isolate algorithmic selection from raw passage volume, we enforce strict matched-depth comparisons at average depth</w:t>
+        <w:t xml:space="preserve">) alongside retrieval recall, meaning uncalibrated comparisons easily confound algorithmic selection capability with the statistical advantage of inspecting more text. To isolate genuine algorithmic performance from raw passage volume, our evaluation enforces rigorous matched-depth benchmarking fixed at reference depth</w:t>
       </w:r>
       <w:r>
         <w:t xml:space="preserve"> </w:t>
@@ -2463,7 +2452,7 @@
         <w:pStyle w:val="FirstParagraph"/>
       </w:pPr>
       <w:r>
-        <w:t xml:space="preserve">Standard dense retrieval models employ bi-encoder architectures that map queries and documents into a shared vector space independently, enabling fast approximate nearest neighbor search but sacrificing token-level cross-attention. Cross-encoder re-rankers improve precision by processing concatenated query–document text. Collini et al. </w:t>
+        <w:t xml:space="preserve">Traditional dense passage retrieval systems rely upon dual-encoder architectures that project queries and candidate documents into vector representations asynchronously, facilitating rapid sub-linear search while forfeiting fine-grained token-level cross-attention. Incorporating cross-encoder re-ranking stages substantially sharpens precision by computing bidirectional cross-attention over fused query–document sequences. Collini et al. </w:t>
       </w:r>
       <w:r>
         <w:t xml:space="preserve">[1]</w:t>
@@ -2472,7 +2461,7 @@
         <w:t xml:space="preserve"> </w:t>
       </w:r>
       <w:r>
-        <w:t xml:space="preserve">introduced Context-Aware RAG (CA-RAG), demonstrating that filtering context inconsistencies via similarity validation improves generation faithfulness. In our framework, Arm 1 serves as a CA-RAG-style dense retrieval baseline, over which we evaluate cross-encoder re-ranking, post-hoc calibration, and multi-hop gating.</w:t>
+        <w:t xml:space="preserve">formulated Context-Aware RAG (CA-RAG), showing that pruning semantic incongruities through similarity validation enhances downstream factual alignment. Within our evaluation taxonomy, Arm 1 serves as a CA-RAG-aligned dense bi-encoder benchmark, upon which we systematically contrast cross-encoder re-ranking, parametric calibration, and multi-hop gating policies.</w:t>
       </w:r>
     </w:p>
     <w:bookmarkEnd w:id="10"/>
@@ -2490,7 +2479,7 @@
         <w:pStyle w:val="FirstParagraph"/>
       </w:pPr>
       <w:r>
-        <w:t xml:space="preserve">Adaptive retrieval approaches adjust retrieval depth or frequency based on query characteristics. Kratzwald and Feuerriegel </w:t>
+        <w:t xml:space="preserve">Adaptive retrieval paradigms modulate the frequency or depth of corpus interaction according to query-specific indicators. Kratzwald and Feuerriegel </w:t>
       </w:r>
       <w:r>
         <w:t xml:space="preserve">[3]</w:t>
@@ -2499,7 +2488,7 @@
         <w:t xml:space="preserve"> </w:t>
       </w:r>
       <w:r>
-        <w:t xml:space="preserve">investigated query-adaptive document retrieval depths for deep question answering. Adaptive-RAG </w:t>
+        <w:t xml:space="preserve">explored query-adaptive retrieval horizons for complex question answering pipelines. Adaptive-RAG </w:t>
       </w:r>
       <w:r>
         <w:t xml:space="preserve">[4]</w:t>
@@ -2508,7 +2497,7 @@
         <w:t xml:space="preserve"> </w:t>
       </w:r>
       <w:r>
-        <w:t xml:space="preserve">routes queries to no-retrieval, single-step, or multi-step paths via a complexity classifier. Training-free gating methods, such as TARG </w:t>
+        <w:t xml:space="preserve">dynamically steers requests across non-retrieval, single-step, or iterative pathways utilizing a dedicated query difficulty classifier. Training-free gating strategies, exemplified by TARG </w:t>
       </w:r>
       <w:r>
         <w:t xml:space="preserve">[6]</w:t>
@@ -2526,7 +2515,7 @@
         <w:t xml:space="preserve"> </w:t>
       </w:r>
       <w:r>
-        <w:t xml:space="preserve">(which steers retrieval through honesty and confidence directions in LLM internal representations), assess when retrieval is required. For long-form text generation, active methods such as FLARE </w:t>
+        <w:t xml:space="preserve">(which steers retrieval through honesty and confidence directions in LLM internal representations), evaluate when context lookup is justified. For extended generative synthesis, proactive architectures such as FLARE </w:t>
       </w:r>
       <w:r>
         <w:t xml:space="preserve">[10]</w:t>
@@ -2547,7 +2536,7 @@
         <w:t xml:space="preserve"> </w:t>
       </w:r>
       <w:r>
-        <w:t xml:space="preserve">dynamically trigger retrieval when confidence falls below fixed thresholds. However, these systems focus primarily on retrieval invocation rather than resolving the optimal chunk count (</w:t>
+        <w:t xml:space="preserve">activate retrieval when internal token certainty drops below specified thresholds. Nevertheless, existing frameworks predominantly emphasize the binary trigger of retrieval rather than resolving the optimal passage count (</w:t>
       </w:r>
       <m:oMath>
         <m:r>
@@ -2555,7 +2544,7 @@
         </m:r>
       </m:oMath>
       <w:r>
-        <w:t xml:space="preserve">) under matched-depth constraints.</w:t>
+        <w:t xml:space="preserve">) under strict matched-depth controls.</w:t>
       </w:r>
     </w:p>
     <w:bookmarkEnd w:id="11"/>
@@ -2582,16 +2571,13 @@
         <w:t xml:space="preserve"> </w:t>
       </w:r>
       <w:r>
-        <w:t xml:space="preserve">showed that modern neural networks often output uncalibrated probabilities that overestimate empirical correctness. Post-processing methods such as temperature scaling and Platt scaling </w:t>
+        <w:t xml:space="preserve">established that deep neural models systematically output overconfident probability estimates that misstate true empirical correctness. Post-processing recalibration techniques, notably temperature scaling and Platt scaling </w:t>
       </w:r>
       <w:r>
         <w:t xml:space="preserve">[9]</w:t>
       </w:r>
       <w:r>
-        <w:t xml:space="preserve"> </w:t>
-      </w:r>
-      <w:r>
-        <w:t xml:space="preserve">fit parametric mappings on held-out validation sets to convert raw scores into calibrated posterior probabilities. We examine whether recalibrating cross-encoder relevance logits can support robust stopping thresholds in multi-hop retrieval.</w:t>
+        <w:t xml:space="preserve">, optimize parametric functions over held-out calibration partitions to transform uncalibrated raw scores into faithful posterior probabilities. In this paper, we examine whether recalibrating cross-encoder relevance logits can provide dependable stopping boundaries during multi-hop document retrieval.</w:t>
       </w:r>
     </w:p>
     <w:bookmarkEnd w:id="12"/>
@@ -2609,7 +2595,7 @@
         <w:pStyle w:val="FirstParagraph"/>
       </w:pPr>
       <w:r>
-        <w:t xml:space="preserve">Multi-hop question answering requires traversing reasoning chains across disconnected documents. Multi-hop Dense Retrieval (MDR) </w:t>
+        <w:t xml:space="preserve">Multi-hop question answering necessitates tracing multi-step reasoning trajectories across disjoint passages. Architectures such as Multi-hop Dense Retrieval (MDR) </w:t>
       </w:r>
       <w:r>
         <w:t xml:space="preserve">[12]</w:t>
@@ -2627,7 +2613,7 @@
         <w:t xml:space="preserve"> </w:t>
       </w:r>
       <w:r>
-        <w:t xml:space="preserve">train specialized multi-hop encoders to navigate document graphs. Interleaved methods like IRCoT </w:t>
+        <w:t xml:space="preserve">train specialized multi-hop encoders to navigate dense document networks. Synergistic approaches like IRCoT </w:t>
       </w:r>
       <w:r>
         <w:t xml:space="preserve">[14]</w:t>
@@ -2636,7 +2622,7 @@
         <w:t xml:space="preserve"> </w:t>
       </w:r>
       <w:r>
-        <w:t xml:space="preserve">interleave chain-of-thought generation with retrieval hops. In contrast to training specialized multi-hop encoders, we examine whether post-hoc calibration and confidence gating can govern retrieval depth using off-the-shelf bi-encoder and cross-encoder models.</w:t>
+        <w:t xml:space="preserve">alternate chain-of-thought token generation with intermediate retrieval steps. Rather than training specialized multi-hop representations from scratch, our work evaluates whether post-hoc probability calibration and confidence-based halting can effectively manage retrieval depth using widely deployed, off-the-shelf bi-encoders and cross-encoders.</w:t>
       </w:r>
     </w:p>
     <w:bookmarkEnd w:id="13"/>
@@ -2664,7 +2650,7 @@
         <w:pStyle w:val="FirstParagraph"/>
       </w:pPr>
       <w:r>
-        <w:t xml:space="preserve">We evaluate six retrieval paradigms (Arms 1–6) operating over the per-question pool of</w:t>
+        <w:t xml:space="preserve">We benchmark six distinct retrieval methodologies (Arms 1–6) operating over the standard candidate pool of</w:t>
       </w:r>
       <w:r>
         <w:t xml:space="preserve"> </w:t>
@@ -2684,7 +2670,7 @@
         <w:t xml:space="preserve"> </w:t>
       </w:r>
       <w:r>
-        <w:t xml:space="preserve">paragraphs in HotpotQA’s distractor setting:</w:t>
+        <w:t xml:space="preserve">passages per HotpotQA item in the distractor configuration:</w:t>
       </w:r>
     </w:p>
     <w:p>
@@ -3060,7 +3046,7 @@
         <w:t xml:space="preserve"> </w:t>
       </w:r>
       <w:r>
-        <w:t xml:space="preserve">Walks down the ranked candidate list from the cross-encoder, selecting passages where raw score</w:t>
+        <w:t xml:space="preserve">Traverses the ranked passage list generated by the cross-encoder, retaining candidates whose unnormalized logit satisfies</w:t>
       </w:r>
       <w:r>
         <w:t xml:space="preserve"> </w:t>
@@ -3117,7 +3103,7 @@
         </m:sSub>
       </m:oMath>
       <w:r>
-        <w:t xml:space="preserve">, with a minimum of 1 and a maximum of 6 chunks.</w:t>
+        <w:t xml:space="preserve">, bounded between a minimum of 1 and a maximum of 6 chunks.</w:t>
       </w:r>
     </w:p>
     <w:p>
@@ -3139,7 +3125,7 @@
         <w:t xml:space="preserve"> </w:t>
       </w:r>
       <w:r>
-        <w:t xml:space="preserve">Transforms raw logits</w:t>
+        <w:t xml:space="preserve">Maps raw logits</w:t>
       </w:r>
       <w:r>
         <w:t xml:space="preserve"> </w:t>
@@ -3216,7 +3202,7 @@
         <w:t xml:space="preserve"> </w:t>
       </w:r>
       <w:r>
-        <w:t xml:space="preserve">via Platt scaling and walks down the ranked list, selecting passages satisfying</w:t>
+        <w:t xml:space="preserve">via Platt scaling and steps through the ordered list, selecting items meeting</w:t>
       </w:r>
       <w:r>
         <w:t xml:space="preserve"> </w:t>
@@ -3243,7 +3229,7 @@
         </m:r>
       </m:oMath>
       <w:r>
-        <w:t xml:space="preserve">, with a minimum of 1 and a maximum of 6 chunks. We evaluate both global pooled scaling (</w:t>
+        <w:t xml:space="preserve">, constrained between 1 and 6 chunks. We examine both global pooled scaling (</w:t>
       </w:r>
       <w:r>
         <w:rPr>
@@ -3297,7 +3283,7 @@
         <w:t xml:space="preserve"> </w:t>
       </w:r>
       <w:r>
-        <w:t xml:space="preserve">Iterates up to 6 hops over the per-question candidate pool. At hop 0, remaining candidates are scored against query</w:t>
+        <w:t xml:space="preserve">Performs iterative multi-hop traversal up to 6 hops over the per-question pool. At hop 0, remaining passages are evaluated against query</w:t>
       </w:r>
       <w:r>
         <w:t xml:space="preserve"> </w:t>
@@ -3311,7 +3297,7 @@
         <w:t xml:space="preserve"> </w:t>
       </w:r>
       <w:r>
-        <w:t xml:space="preserve">alone; at each subsequent hop</w:t>
+        <w:t xml:space="preserve">alone; at each successive hop</w:t>
       </w:r>
       <w:r>
         <w:t xml:space="preserve"> </w:t>
@@ -3331,7 +3317,7 @@
         </m:r>
       </m:oMath>
       <w:r>
-        <w:t xml:space="preserve">, the cross-encoder scores all remaining candidates against</w:t>
+        <w:t xml:space="preserve">, the cross-encoder re-evaluates all remaining candidates against</w:t>
       </w:r>
       <w:r>
         <w:t xml:space="preserve"> </w:t>
@@ -3345,7 +3331,7 @@
         <w:t xml:space="preserve"> </w:t>
       </w:r>
       <w:r>
-        <w:t xml:space="preserve">concatenated with the full text of the previously selected chunk (</w:t>
+        <w:t xml:space="preserve">concatenated with the full text of the most recently retrieved chunk (</w:t>
       </w:r>
       <m:oMath>
         <m:r>
@@ -3396,7 +3382,7 @@
         </m:sSub>
       </m:oMath>
       <w:r>
-        <w:t xml:space="preserve">). The best candidate is selected; for hops</w:t>
+        <w:t xml:space="preserve">). The top candidate is chosen; for hops</w:t>
       </w:r>
       <w:r>
         <w:t xml:space="preserve"> </w:t>
@@ -3416,7 +3402,7 @@
         </m:r>
       </m:oMath>
       <w:r>
-        <w:t xml:space="preserve">, retrieval stops if its per-type Platt probability falls below</w:t>
+        <w:t xml:space="preserve">, traversal terminates whenever its per-type Platt probability falls below</w:t>
       </w:r>
       <w:r>
         <w:t xml:space="preserve"> </w:t>
@@ -3430,7 +3416,7 @@
         <w:t xml:space="preserve"> </w:t>
       </w:r>
       <w:r>
-        <w:t xml:space="preserve">(max 6 chunks). No bi-encoder is used after the initial candidate pool is formed; 50-word truncation is evaluated only as an ablation in Section IV-G.</w:t>
+        <w:t xml:space="preserve">(max 6 chunks). No bi-encoder is re-invoked once the initial candidate set is formed; a 50-word prefix truncation baseline is analyzed strictly as an ablation in Section IV-G.</w:t>
       </w:r>
     </w:p>
     <w:p>
@@ -3452,7 +3438,7 @@
         <w:t xml:space="preserve"> </w:t>
       </w:r>
       <w:r>
-        <w:t xml:space="preserve">Evaluates a supervised logistic regression classifier with feature standardization trained on calibration traces. The classifier uses 6 features: calibrated probability of the next candidate, its raw cross-encoder score, hop index, probability drop from the previous hop, minimum calibrated probability among already selected chunks, and a binary indicator for bridge questions (</w:t>
+        <w:t xml:space="preserve">Implements a supervised logistic regression classifier with standardized feature preprocessing trained on calibration traces. The model leverages 6 features: calibrated probability of the incoming candidate, its raw logit, hop index, probability differential from the preceding hop, minimum calibrated probability among already selected passages, and a binary indicator for bridge questions (</w:t>
       </w:r>
       <w:r>
         <w:rPr>
@@ -3461,7 +3447,7 @@
         <w:t xml:space="preserve">is_bridge</w:t>
       </w:r>
       <w:r>
-        <w:t xml:space="preserve">). The binary training label indicates whether all gold supporting paragraphs have already been selected. At each hop</w:t>
+        <w:t xml:space="preserve">). The binary target signals whether all gold supporting passages have been accumulated. At each hop</w:t>
       </w:r>
       <w:r>
         <w:t xml:space="preserve"> </w:t>
@@ -3481,7 +3467,7 @@
         </m:r>
       </m:oMath>
       <w:r>
-        <w:t xml:space="preserve">, retrieval stops if candidate probability falls below</w:t>
+        <w:t xml:space="preserve">, retrieval halts if candidate confidence drops below</w:t>
       </w:r>
       <w:r>
         <w:t xml:space="preserve"> </w:t>
@@ -3495,7 +3481,7 @@
         <w:t xml:space="preserve"> </w:t>
       </w:r>
       <w:r>
-        <w:t xml:space="preserve">or if posterior</w:t>
+        <w:t xml:space="preserve">or if the posterior</w:t>
       </w:r>
       <w:r>
         <w:t xml:space="preserve"> </w:t>
@@ -3549,7 +3535,7 @@
         <w:t xml:space="preserve"> </w:t>
       </w:r>
       <w:r>
-        <w:t xml:space="preserve">(subject to a 6-chunk ceiling).</w:t>
+        <w:t xml:space="preserve">(subject to a 6-chunk maximum).</w:t>
       </w:r>
     </w:p>
     <w:bookmarkEnd w:id="15"/>
@@ -3567,7 +3553,7 @@
         <w:pStyle w:val="FirstParagraph"/>
       </w:pPr>
       <w:r>
-        <w:t xml:space="preserve">Given a cross-encoder scoring query–passage pairs</w:t>
+        <w:t xml:space="preserve">Given a cross-encoder assigning raw continuous scores</w:t>
       </w:r>
       <w:r>
         <w:t xml:space="preserve"> </w:t>
@@ -3621,7 +3607,7 @@
         </m:r>
       </m:oMath>
       <w:r>
-        <w:t xml:space="preserve">, we fit an affine transformation mapped through the logistic sigmoid function </w:t>
+        <w:t xml:space="preserve">, we fit an affine logit adjustment passed through the standard logistic sigmoid function </w:t>
       </w:r>
       <w:r>
         <w:t xml:space="preserve">[9]</w:t>
@@ -3853,7 +3839,7 @@
         <w:t xml:space="preserve"> </w:t>
       </w:r>
       <w:r>
-        <w:t xml:space="preserve">denotes binary ground-truth supporting paragraph relevance. Parameters</w:t>
+        <w:t xml:space="preserve">represents ground-truth supporting document relevance. Parameters</w:t>
       </w:r>
       <w:r>
         <w:t xml:space="preserve"> </w:t>
@@ -3889,7 +3875,7 @@
         <w:t xml:space="preserve"> </w:t>
       </w:r>
       <w:r>
-        <w:t xml:space="preserve">are estimated on the calibration split by minimizing binary cross-entropy:</w:t>
+        <w:t xml:space="preserve">are determined on the calibration set by minimizing binary cross-entropy loss:</w:t>
       </w:r>
     </w:p>
     <w:p>
@@ -4126,7 +4112,7 @@
         <w:pStyle w:val="FirstParagraph"/>
       </w:pPr>
       <w:r>
-        <w:t xml:space="preserve">Calibration quality is evaluated using Expected Calibration Error (ECE) across</w:t>
+        <w:t xml:space="preserve">Calibration fidelity is measured via Expected Calibration Error (ECE) across</w:t>
       </w:r>
       <w:r>
         <w:t xml:space="preserve"> </w:t>
@@ -4149,7 +4135,7 @@
         <w:t xml:space="preserve"> </w:t>
       </w:r>
       <w:r>
-        <w:t xml:space="preserve">equal-width probability bins</w:t>
+        <w:t xml:space="preserve">uniform probability bins</w:t>
       </w:r>
       <w:r>
         <w:t xml:space="preserve"> </w:t>
@@ -4375,7 +4361,7 @@
         <w:pStyle w:val="FirstParagraph"/>
       </w:pPr>
       <w:r>
-        <w:t xml:space="preserve">alongside the Brier score:</w:t>
+        <w:t xml:space="preserve">paired with the mean squared probability error (Brier score):</w:t>
       </w:r>
       <w:r>
         <w:t xml:space="preserve"> </w:t>
@@ -4516,7 +4502,7 @@
         <w:pStyle w:val="FirstParagraph"/>
       </w:pPr>
       <w:r>
-        <w:t xml:space="preserve">For multi-hop questions, early retrieval hops often surface an introductory entity whose text reveals intermediate entities required for subsequent reasoning. In Arm 5 and ungated iterative retrieval, retrieval iterates up to 6 hops over the per-question pool of</w:t>
+        <w:t xml:space="preserve">In multi-hop settings, early search steps often retrieve an introductory passage whose textual body uncovers bridging entities necessary for subsequent inference. In Arm 5 and ungated multi-step retrieval, traversal iterates up to 6 hops over the per-query pool of</w:t>
       </w:r>
       <w:r>
         <w:t xml:space="preserve"> </w:t>
@@ -4536,7 +4522,7 @@
         <w:t xml:space="preserve"> </w:t>
       </w:r>
       <w:r>
-        <w:t xml:space="preserve">candidate paragraphs without re-invoking the bi-encoder. At hop 0, candidate passages are scored against</w:t>
+        <w:t xml:space="preserve">candidates without re-executing bi-encoder retrieval. At hop 0, candidate texts are matched against</w:t>
       </w:r>
       <w:r>
         <w:t xml:space="preserve"> </w:t>
@@ -4570,7 +4556,7 @@
         </m:r>
       </m:oMath>
       <w:r>
-        <w:t xml:space="preserve">, the cross-encoder scores all remaining candidates against the question concatenated with the full text of the chunk selected at hop</w:t>
+        <w:t xml:space="preserve">, the cross-encoder re-ranks all unselected candidates against the prompt augmented with the complete passage selected at hop</w:t>
       </w:r>
       <w:r>
         <w:t xml:space="preserve"> </w:t>
@@ -4695,7 +4681,7 @@
         <w:pStyle w:val="FirstParagraph"/>
       </w:pPr>
       <w:r>
-        <w:t xml:space="preserve">The highest-scoring remaining passage is selected. In Arm 5, for hops</w:t>
+        <w:t xml:space="preserve">The highest-ranking available candidate is extracted. In Arm 5, for hops</w:t>
       </w:r>
       <w:r>
         <w:t xml:space="preserve"> </w:t>
@@ -4715,7 +4701,7 @@
         </m:r>
       </m:oMath>
       <w:r>
-        <w:t xml:space="preserve">, retrieval terminates if the candidate’s per-type Platt probability falls below threshold</w:t>
+        <w:t xml:space="preserve">, search halts if the candidate’s type-specific Platt probability drops below</w:t>
       </w:r>
       <w:r>
         <w:t xml:space="preserve"> </w:t>
@@ -4729,7 +4715,7 @@
         <w:t xml:space="preserve"> </w:t>
       </w:r>
       <w:r>
-        <w:t xml:space="preserve">(min 1, max 6 chunks). In Section IV-G, we ablate this full-chunk concatenation against a 50-word prefix truncation variant (</w:t>
+        <w:t xml:space="preserve">(min 1, max 6 chunks). In Section IV-G, we contrast this complete passage concatenation with a 50-word prefix truncation variant (</w:t>
       </w:r>
       <m:oMath>
         <m:r>
@@ -4808,7 +4794,7 @@
         </m:r>
       </m:oMath>
       <w:r>
-        <w:t xml:space="preserve">) to evaluate whether passage length introduces token dilution during cross-encoder re-ranking.</w:t>
+        <w:t xml:space="preserve">) to verify whether excessive passage length induces token dilution during cross-attention re-ranking.</w:t>
       </w:r>
     </w:p>
     <w:bookmarkEnd w:id="17"/>
@@ -15081,7 +15067,7 @@
         <w:pStyle w:val="FirstParagraph"/>
       </w:pPr>
       <w:r>
-        <w:t xml:space="preserve">Our findings show that neither post-hoc calibration nor confidence-based gating enables adaptive-</w:t>
+        <w:t xml:space="preserve">Our empirical findings reveal that neither post-hoc calibration nor confidence-based gating enables adaptive-</w:t>
       </w:r>
       <m:oMath>
         <m:r>
@@ -15092,7 +15078,7 @@
         <w:t xml:space="preserve"> </w:t>
       </w:r>
       <w:r>
-        <w:t xml:space="preserve">retrieval to consistently exceed static depth baselines in multi-hop RAG. We propose three mechanistic hypotheses to examine the dynamics behind these empirical results.</w:t>
+        <w:t xml:space="preserve">retrieval to consistently surpass static fixed-depth baselines in multi-hop RAG. We offer three mechanistic hypotheses to interpret these observations.</w:t>
       </w:r>
     </w:p>
     <w:bookmarkStart w:id="40" w:name="_087a9059fb1b423ef9a31c539cec840d073662f"/>
@@ -15109,7 +15095,7 @@
         <w:pStyle w:val="FirstParagraph"/>
       </w:pPr>
       <w:r>
-        <w:t xml:space="preserve">We hypothesize that the limitation of calibrated gating stems from a structural misalignment between</w:t>
+        <w:t xml:space="preserve">We hypothesize that the core bottleneck of calibrated gating stems from the tension between</w:t>
       </w:r>
       <w:r>
         <w:t xml:space="preserve"> </w:t>
@@ -15135,10 +15121,10 @@
           <w:i/>
           <w:iCs/>
         </w:rPr>
-        <w:t xml:space="preserve">set-level sufficiency</w:t>
-      </w:r>
-      <w:r>
-        <w:t xml:space="preserve">. Platt scaling is designed to ensure that across retrieved chunks with predicted probability</w:t>
+        <w:t xml:space="preserve">set-level evidence sufficiency</w:t>
+      </w:r>
+      <w:r>
+        <w:t xml:space="preserve">. Platt scaling is designed to ensure that among candidate chunks assigned predicted probability</w:t>
       </w:r>
       <w:r>
         <w:t xml:space="preserve"> </w:t>
@@ -15165,7 +15151,7 @@
         </m:r>
       </m:oMath>
       <w:r>
-        <w:t xml:space="preserve">, approximately 30% are true supporting paragraphs in distribution—a property that holds closely in our empirical measurements, where calibration reduces ECE to</w:t>
+        <w:t xml:space="preserve">, approximately 30% constitute genuine supporting documents in distribution—an alignment verified empirically, reducing ECE to</w:t>
       </w:r>
       <w:r>
         <w:t xml:space="preserve"> </w:t>
@@ -15193,7 +15179,7 @@
         <w:t xml:space="preserve"> </w:t>
       </w:r>
       <w:r>
-        <w:t xml:space="preserve">on extension. Yet multi-hop resolution requires retrieving all disjoint supporting paragraphs together. A gating policy that independently discards chunks whose probability falls below</w:t>
+        <w:t xml:space="preserve">on extension. Yet resolving multi-hop questions requires assembling disjoint supporting facts jointly. An independent stopping rule that drops candidates when individual probability falls below</w:t>
       </w:r>
       <w:r>
         <w:t xml:space="preserve"> </w:t>
@@ -15207,7 +15193,7 @@
         <w:t xml:space="preserve"> </w:t>
       </w:r>
       <w:r>
-        <w:t xml:space="preserve">disproportionately prunes the second hop: bridge paragraphs often have lower initial semantic overlap with the question than the first-hop entity paragraph. Consequently, thresholding at the chunk level truncates multi-hop reasoning paths, resulting in set-level recall loss at low retrieval depths.</w:t>
+        <w:t xml:space="preserve">prematurely severs multi-hop chains: bridge passages often share less initial lexical overlap with the query than first-hop texts. Consequently, chunk-level thresholding prunes reasoning chains mid-traversal, degrading set-level recall at tight budgets.</w:t>
       </w:r>
     </w:p>
     <w:bookmarkEnd w:id="40"/>
@@ -15225,7 +15211,7 @@
         <w:pStyle w:val="FirstParagraph"/>
       </w:pPr>
       <w:r>
-        <w:t xml:space="preserve">The divergent effect of hop-conditioned query reformulation—improving bridge questions (</w:t>
+        <w:t xml:space="preserve">The polarized impact of hop-conditioned query augmentation—advancing bridge questions (</w:t>
       </w:r>
       <m:oMath>
         <m:r>
@@ -15271,7 +15257,7 @@
         </m:r>
       </m:oMath>
       <w:r>
-        <w:t xml:space="preserve">) while degrading comparison questions (</w:t>
+        <w:t xml:space="preserve">) while impairing comparison queries (</w:t>
       </w:r>
       <m:oMath>
         <m:r>
@@ -15317,7 +15303,7 @@
         </m:r>
       </m:oMath>
       <w:r>
-        <w:t xml:space="preserve">)—can be explained by structural differences in reasoning graphs:</w:t>
+        <w:t xml:space="preserve">)—stems directly from the underlying graph topology of the reasoning task:</w:t>
       </w:r>
     </w:p>
     <w:p>
@@ -15339,7 +15325,7 @@
         <w:t xml:space="preserve"> </w:t>
       </w:r>
       <w:r>
-        <w:t xml:space="preserve">Bridge questions exhibit sequential dependency (</w:t>
+        <w:t xml:space="preserve">Bridge queries follow a sequential chain (</w:t>
       </w:r>
       <m:oMath>
         <m:r>
@@ -15365,7 +15351,7 @@
         </m:r>
       </m:oMath>
       <w:r>
-        <w:t xml:space="preserve">). The initial question references entity</w:t>
+        <w:t xml:space="preserve">). The prompt mentions entity</w:t>
       </w:r>
       <w:r>
         <w:t xml:space="preserve"> </w:t>
@@ -15376,7 +15362,7 @@
         </m:r>
       </m:oMath>
       <w:r>
-        <w:t xml:space="preserve">, while evidence for</w:t>
+        <w:t xml:space="preserve">, while evidence regarding</w:t>
       </w:r>
       <w:r>
         <w:t xml:space="preserve"> </w:t>
@@ -15390,7 +15376,7 @@
         <w:t xml:space="preserve"> </w:t>
       </w:r>
       <w:r>
-        <w:t xml:space="preserve">requires discovering intermediate bridge entity</w:t>
+        <w:t xml:space="preserve">requires uncovering intermediate link entity</w:t>
       </w:r>
       <w:r>
         <w:t xml:space="preserve"> </w:t>
@@ -15401,7 +15387,7 @@
         </m:r>
       </m:oMath>
       <w:r>
-        <w:t xml:space="preserve">. Appending the previously selected chunk injects entity</w:t>
+        <w:t xml:space="preserve">. Concatenating the text of the previously retrieved chunk injects entity</w:t>
       </w:r>
       <w:r>
         <w:t xml:space="preserve"> </w:t>
@@ -15415,7 +15401,7 @@
         <w:t xml:space="preserve"> </w:t>
       </w:r>
       <w:r>
-        <w:t xml:space="preserve">into the cross-encoder context, bridging the lexical gap.</w:t>
+        <w:t xml:space="preserve">into the cross-encoder input, bridging the semantic gap.</w:t>
       </w:r>
     </w:p>
     <w:p>
@@ -15437,7 +15423,7 @@
         <w:t xml:space="preserve"> </w:t>
       </w:r>
       <w:r>
-        <w:t xml:space="preserve">Comparison questions exhibit parallel dependency (</w:t>
+        <w:t xml:space="preserve">Comparison queries follow a parallel structure (</w:t>
       </w:r>
       <m:oMath>
         <m:r>
@@ -15455,7 +15441,7 @@
         </m:r>
       </m:oMath>
       <w:r>
-        <w:t xml:space="preserve">). The question explicitly mentions both entities (e.g.,</w:t>
+        <w:t xml:space="preserve">), explicitly mentioning both target entities in the initial question (e.g.,</w:t>
       </w:r>
       <w:r>
         <w:t xml:space="preserve"> </w:t>
@@ -15468,7 +15454,7 @@
         <w:t xml:space="preserve">“Were Scott Derrickson and Ed Wood of the same nationality?”</w:t>
       </w:r>
       <w:r>
-        <w:t xml:space="preserve">). We hypothesize that appending context from entity</w:t>
+        <w:t xml:space="preserve">). We hypothesize that appending context describing entity</w:t>
       </w:r>
       <w:r>
         <w:t xml:space="preserve"> </w:t>
@@ -15482,7 +15468,7 @@
         <w:t xml:space="preserve"> </w:t>
       </w:r>
       <w:r>
-        <w:t xml:space="preserve">biases the cross-encoder attention toward</w:t>
+        <w:t xml:space="preserve">over-indexes cross-encoder attention onto</w:t>
       </w:r>
       <w:r>
         <w:t xml:space="preserve"> </w:t>
@@ -15493,7 +15479,7 @@
         </m:r>
       </m:oMath>
       <w:r>
-        <w:t xml:space="preserve">, displacing entity</w:t>
+        <w:t xml:space="preserve">, crowding out entity</w:t>
       </w:r>
       <w:r>
         <w:t xml:space="preserve"> </w:t>
@@ -15507,7 +15493,7 @@
         <w:t xml:space="preserve"> </w:t>
       </w:r>
       <w:r>
-        <w:t xml:space="preserve">during subsequent re-ranking. This hypothesized query drift degrades comparison recall.</w:t>
+        <w:t xml:space="preserve">during subsequent re-ranking steps. This hypothesized query drift impairs comparison recall.</w:t>
       </w:r>
     </w:p>
     <w:bookmarkEnd w:id="41"/>
@@ -15525,7 +15511,7 @@
         <w:pStyle w:val="FirstParagraph"/>
       </w:pPr>
       <w:r>
-        <w:t xml:space="preserve">Our evaluation of the Oracle Hybrid system indicates that retrieval policies are question-structure dependent. While adaptive score gating fails to exceed fixed-</w:t>
+        <w:t xml:space="preserve">Our assessment of the Oracle Hybrid pipeline demonstrates that optimal retrieval policy is intrinsically tied to question topology. While score-level thresholding fails to reliably beat fixed-</w:t>
       </w:r>
       <m:oMath>
         <m:r>
@@ -15533,7 +15519,7 @@
         </m:r>
       </m:oMath>
       <w:r>
-        <w:t xml:space="preserve">, routing queries based on topological reasoning type achieves</w:t>
+        <w:t xml:space="preserve">, routing queries according to reasoning topology achieves</w:t>
       </w:r>
       <w:r>
         <w:t xml:space="preserve"> </w:t>
@@ -15581,7 +15567,7 @@
         </m:r>
       </m:oMath>
       <w:r>
-        <w:t xml:space="preserve">. However, because this relies on an oracle question-type label, practical deployment requires developing zero-shot question-topology classifiers prior to retrieval invocation.</w:t>
+        <w:t xml:space="preserve">. However, because this upper bound presumes access to ground-truth question classifications, practical deployments must prioritize topology-detection classifiers prior to context assembly.</w:t>
       </w:r>
     </w:p>
     <w:bookmarkEnd w:id="42"/>
@@ -15600,7 +15586,7 @@
         <w:pStyle w:val="FirstParagraph"/>
       </w:pPr>
       <w:r>
-        <w:t xml:space="preserve">We document eight key limitations of this study:</w:t>
+        <w:t xml:space="preserve">We outline eight primary limitations governing our study:</w:t>
       </w:r>
     </w:p>
     <w:p>
@@ -15616,19 +15602,19 @@
           <w:b/>
           <w:bCs/>
         </w:rPr>
-        <w:t xml:space="preserve">HotpotQA Benchmark Scope:</w:t>
-      </w:r>
-      <w:r>
-        <w:t xml:space="preserve"> </w:t>
-      </w:r>
-      <w:r>
-        <w:t xml:space="preserve">Our empirical study is conducted exclusively on HotpotQA </w:t>
+        <w:t xml:space="preserve">Benchmark Generalization:</w:t>
+      </w:r>
+      <w:r>
+        <w:t xml:space="preserve"> </w:t>
+      </w:r>
+      <w:r>
+        <w:t xml:space="preserve">Our investigation is grounded within HotpotQA </w:t>
       </w:r>
       <w:r>
         <w:t xml:space="preserve">[5]</w:t>
       </w:r>
       <w:r>
-        <w:t xml:space="preserve">. While HotpotQA is a standard multi-hop benchmark, other multi-hop datasets (e.g., 2WikiMultiHopQA, MuSiQue) feature different hop distributions, distractor compositions, and entity connectivity.</w:t>
+        <w:t xml:space="preserve">. Although HotpotQA represents a canonical multi-hop benchmark, alternate datasets (such as 2WikiMultiHopQA and MuSiQue) present differing reasoning hop depths, negative distractor distributions, and entity graph topologies.</w:t>
       </w:r>
     </w:p>
     <w:p>
@@ -15644,13 +15630,13 @@
           <w:b/>
           <w:bCs/>
         </w:rPr>
-        <w:t xml:space="preserve">Distractor Setting Constraints:</w:t>
-      </w:r>
-      <w:r>
-        <w:t xml:space="preserve"> </w:t>
-      </w:r>
-      <w:r>
-        <w:t xml:space="preserve">Experiments operate over HotpotQA’s distractor setting, where each query is paired with a per-question candidate pool of</w:t>
+        <w:t xml:space="preserve">Distractor Setting Scope:</w:t>
+      </w:r>
+      <w:r>
+        <w:t xml:space="preserve"> </w:t>
+      </w:r>
+      <w:r>
+        <w:t xml:space="preserve">All experiments operate in HotpotQA’s distractor setting, evaluating a per-query pool of</w:t>
       </w:r>
       <w:r>
         <w:t xml:space="preserve"> </w:t>
@@ -15670,7 +15656,7 @@
         <w:t xml:space="preserve"> </w:t>
       </w:r>
       <w:r>
-        <w:t xml:space="preserve">paragraphs (2 gold supporting facts, 8 hard negative distractors). While this setting isolates re-ranking and threshold gating among difficult negatives, it does not evaluate full-corpus open-domain indexing over millions of documents.</w:t>
+        <w:t xml:space="preserve">passages (2 ground-truth facts, 8 challenging distractors). While this protocol isolates re-ranking precision and threshold behavior against hard negatives, it does not assess full-scale open-domain retrieval across web-scale corpora.</w:t>
       </w:r>
     </w:p>
     <w:p>
@@ -15686,13 +15672,13 @@
           <w:b/>
           <w:bCs/>
         </w:rPr>
-        <w:t xml:space="preserve">Retrieval-Only Evaluation:</w:t>
-      </w:r>
-      <w:r>
-        <w:t xml:space="preserve"> </w:t>
-      </w:r>
-      <w:r>
-        <w:t xml:space="preserve">Our benchmarks assess retrieval performance directly—namely paragraph recall, precision, and full-match accuracy. While retrieval recall is an upper bound on context availability for generation, we do not evaluate downstream LLM answer generation metrics (Exact Match or F1).</w:t>
+        <w:t xml:space="preserve">Focus on Retrieval Metrics:</w:t>
+      </w:r>
+      <w:r>
+        <w:t xml:space="preserve"> </w:t>
+      </w:r>
+      <w:r>
+        <w:t xml:space="preserve">Our evaluations focus on retrieval-stage fidelity—specifically passage recall, precision, and full-match rate. While retrieval recall bounds context availability for generation, we do not assess downstream language model synthesis metrics (e.g., Exact Match or token F1).</w:t>
       </w:r>
     </w:p>
     <w:p>
@@ -15708,13 +15694,13 @@
           <w:b/>
           <w:bCs/>
         </w:rPr>
-        <w:t xml:space="preserve">Single Embedding and Cross-Encoder Architecture:</w:t>
-      </w:r>
-      <w:r>
-        <w:t xml:space="preserve"> </w:t>
-      </w:r>
-      <w:r>
-        <w:t xml:space="preserve">We evaluated one dense bi-encoder (</w:t>
+        <w:t xml:space="preserve">Model Architectures:</w:t>
+      </w:r>
+      <w:r>
+        <w:t xml:space="preserve"> </w:t>
+      </w:r>
+      <w:r>
+        <w:t xml:space="preserve">We investigated a single bi-encoder (</w:t>
       </w:r>
       <w:r>
         <w:rPr>
@@ -15723,7 +15709,7 @@
         <w:t xml:space="preserve">all-MiniLM-L6-v2</w:t>
       </w:r>
       <w:r>
-        <w:t xml:space="preserve">) and one cross-encoder (</w:t>
+        <w:t xml:space="preserve">) and a single cross-encoder (</w:t>
       </w:r>
       <w:r>
         <w:rPr>
@@ -15732,7 +15718,7 @@
         <w:t xml:space="preserve">ms-marco-MiniLM-L-6-v2</w:t>
       </w:r>
       <w:r>
-        <w:t xml:space="preserve">). Larger architectures (e.g., 7B-parameter cross-encoders or generative re-rankers) may exhibit different calibration and capacity characteristics.</w:t>
+        <w:t xml:space="preserve">). Larger model scales (e.g., 7B-parameter cross-encoders or generative re-rankers) may display distinct calibration characteristics and representational power.</w:t>
       </w:r>
     </w:p>
     <w:p>
@@ -15748,13 +15734,13 @@
           <w:b/>
           <w:bCs/>
         </w:rPr>
-        <w:t xml:space="preserve">Cross-Encoder Sequence Truncation:</w:t>
-      </w:r>
-      <w:r>
-        <w:t xml:space="preserve"> </w:t>
-      </w:r>
-      <w:r>
-        <w:t xml:space="preserve">Cross-encoder inputs were truncated to 512 tokens, which may truncate longer context passages during concatenated multi-hop re-ranking.</w:t>
+        <w:t xml:space="preserve">Context Window Truncation:</w:t>
+      </w:r>
+      <w:r>
+        <w:t xml:space="preserve"> </w:t>
+      </w:r>
+      <w:r>
+        <w:t xml:space="preserve">Cross-encoder inputs were capped at 512 tokens, which may occasionally truncate passage content during concatenated multi-hop re-ranking.</w:t>
       </w:r>
     </w:p>
     <w:p>
@@ -15770,7 +15756,7 @@
           <w:b/>
           <w:bCs/>
         </w:rPr>
-        <w:t xml:space="preserve">Oracle Question-Type Reliance:</w:t>
+        <w:t xml:space="preserve">Reliance on Oracle Question Types:</w:t>
       </w:r>
       <w:r>
         <w:t xml:space="preserve"> </w:t>
@@ -15791,7 +15777,7 @@
         <w:t xml:space="preserve"> </w:t>
       </w:r>
       <w:r>
-        <w:t xml:space="preserve">feature rely on oracle ground-truth question-type labels. In practical deployments, this topological category must be predicted dynamically.</w:t>
+        <w:t xml:space="preserve">feature depend on ground-truth question-type metadata. Real-world systems must predict question topology dynamically.</w:t>
       </w:r>
     </w:p>
     <w:p>
@@ -15807,13 +15793,13 @@
           <w:b/>
           <w:bCs/>
         </w:rPr>
-        <w:t xml:space="preserve">Calibration-Split Hyperparameters:</w:t>
-      </w:r>
-      <w:r>
-        <w:t xml:space="preserve"> </w:t>
-      </w:r>
-      <w:r>
-        <w:t xml:space="preserve">Decision thresholds (</w:t>
+        <w:t xml:space="preserve">Hyperparameter Selection Split:</w:t>
+      </w:r>
+      <w:r>
+        <w:t xml:space="preserve"> </w:t>
+      </w:r>
+      <w:r>
+        <w:t xml:space="preserve">Decision cutoffs (</w:t>
       </w:r>
       <m:oMath>
         <m:sSup>
@@ -15913,7 +15899,7 @@
         </m:r>
       </m:oMath>
       <w:r>
-        <w:t xml:space="preserve">) were tuned on the</w:t>
+        <w:t xml:space="preserve">) were established using the</w:t>
       </w:r>
       <w:r>
         <w:t xml:space="preserve"> </w:t>
@@ -15936,7 +15922,7 @@
         <w:t xml:space="preserve"> </w:t>
       </w:r>
       <w:r>
-        <w:t xml:space="preserve">calibration split. Optimal thresholds may shift under different calibration splits or data distributions.</w:t>
+        <w:t xml:space="preserve">calibration subset. Alternate data distributions may favor different decision thresholds.</w:t>
       </w:r>
     </w:p>
     <w:p>
@@ -15952,7 +15938,16 @@
           <w:b/>
           <w:bCs/>
         </w:rPr>
-        <w:t xml:space="preserve">Post-Hoc Depth Grid, Edge of Sweep (</w:t>
+        <w:t xml:space="preserve">Exploratory Grid Selection and Arm 6 Coverage:</w:t>
+      </w:r>
+      <w:r>
+        <w:t xml:space="preserve"> </w:t>
+      </w:r>
+      <w:r>
+        <w:t xml:space="preserve">The multi-depth grid was chosen post-hoc after inspecting empirical Pareto curves, and depth</w:t>
+      </w:r>
+      <w:r>
+        <w:t xml:space="preserve"> </w:t>
       </w:r>
       <m:oMath>
         <m:r>
@@ -15969,17 +15964,44 @@
         </m:r>
       </m:oMath>
       <w:r>
-        <w:rPr>
-          <w:b/>
-          <w:bCs/>
-        </w:rPr>
-        <w:t xml:space="preserve">), and Arm 6 Coverage:</w:t>
-      </w:r>
-      <w:r>
-        <w:t xml:space="preserve"> </w:t>
-      </w:r>
-      <w:r>
-        <w:t xml:space="preserve">The matched-depth evaluation grid was selected post-hoc following empirical inspection of the Pareto curves, and</w:t>
+        <w:t xml:space="preserve"> </w:t>
+      </w:r>
+      <w:r>
+        <w:t xml:space="preserve">sits at the parameter sweep margin where bootstrap coverage is constrained; thus, the gain (</w:t>
+      </w:r>
+      <m:oMath>
+        <m:r>
+          <m:rPr>
+            <m:sty m:val="p"/>
+          </m:rPr>
+          <m:t>+</m:t>
+        </m:r>
+        <m:r>
+          <m:t>0.0127</m:t>
+        </m:r>
+      </m:oMath>
+      <w:r>
+        <w:t xml:space="preserve">, Holm</w:t>
+      </w:r>
+      <w:r>
+        <w:t xml:space="preserve"> </w:t>
+      </w:r>
+      <m:oMath>
+        <m:r>
+          <m:t>p</m:t>
+        </m:r>
+        <m:r>
+          <m:rPr>
+            <m:sty m:val="p"/>
+          </m:rPr>
+          <m:t>=</m:t>
+        </m:r>
+        <m:r>
+          <m:t>0.0176</m:t>
+        </m:r>
+      </m:oMath>
+      <w:r>
+        <w:t xml:space="preserve">) is exploratory. Additionally, on bridge questions Arm 6 plateaus at mean depth</w:t>
       </w:r>
       <w:r>
         <w:t xml:space="preserve"> </w:t>
@@ -15995,62 +16017,14 @@
           <m:t>=</m:t>
         </m:r>
         <m:r>
-          <m:t>5.5</m:t>
-        </m:r>
-      </m:oMath>
-      <w:r>
-        <w:t xml:space="preserve"> </w:t>
-      </w:r>
-      <w:r>
-        <w:t xml:space="preserve">sits at the extreme edge of the</w:t>
-      </w:r>
-      <w:r>
-        <w:t xml:space="preserve"> </w:t>
-      </w:r>
-      <m:oMath>
-        <m:r>
-          <m:t>θ</m:t>
-        </m:r>
-      </m:oMath>
-      <w:r>
-        <w:t xml:space="preserve"> </w:t>
-      </w:r>
-      <w:r>
-        <w:t xml:space="preserve">sweep where bootstrap coverage is limited. Consequently, the observed gain (</w:t>
-      </w:r>
-      <m:oMath>
-        <m:r>
-          <m:rPr>
-            <m:sty m:val="p"/>
-          </m:rPr>
-          <m:t>+</m:t>
-        </m:r>
-        <m:r>
-          <m:t>0.0127</m:t>
-        </m:r>
-      </m:oMath>
-      <w:r>
-        <w:t xml:space="preserve">, Holm</w:t>
-      </w:r>
-      <w:r>
-        <w:t xml:space="preserve"> </w:t>
-      </w:r>
-      <m:oMath>
-        <m:r>
-          <m:t>p</m:t>
-        </m:r>
-        <m:r>
-          <m:rPr>
-            <m:sty m:val="p"/>
-          </m:rPr>
-          <m:t>=</m:t>
-        </m:r>
-        <m:r>
-          <m:t>0.0176</m:t>
-        </m:r>
-      </m:oMath>
-      <w:r>
-        <w:t xml:space="preserve">) remains exploratory and requires confirmatory validation at higher retrieval depths. Furthermore, on bridge questions, Arm 6 plateaus near mean depth</w:t>
+          <m:t>3.87</m:t>
+        </m:r>
+      </m:oMath>
+      <w:r>
+        <w:t xml:space="preserve"> </w:t>
+      </w:r>
+      <w:r>
+        <w:t xml:space="preserve">and never reaches</w:t>
       </w:r>
       <w:r>
         <w:t xml:space="preserve"> </w:t>
@@ -16066,14 +16040,11 @@
           <m:t>=</m:t>
         </m:r>
         <m:r>
-          <m:t>3.87</m:t>
-        </m:r>
-      </m:oMath>
-      <w:r>
-        <w:t xml:space="preserve"> </w:t>
-      </w:r>
-      <w:r>
-        <w:t xml:space="preserve">and never reaches</w:t>
+          <m:t>4.00</m:t>
+        </m:r>
+      </m:oMath>
+      <w:r>
+        <w:t xml:space="preserve">; on comparison questions, point estimates reach</w:t>
       </w:r>
       <w:r>
         <w:t xml:space="preserve"> </w:t>
@@ -16086,6 +16057,36 @@
           <m:rPr>
             <m:sty m:val="p"/>
           </m:rPr>
+          <m:t>≈</m:t>
+        </m:r>
+        <m:r>
+          <m:t>4.04</m:t>
+        </m:r>
+        <m:r>
+          <m:rPr>
+            <m:nor/>
+            <m:sty m:val="p"/>
+          </m:rPr>
+          <m:t>–</m:t>
+        </m:r>
+        <m:r>
+          <m:t>4.20</m:t>
+        </m:r>
+      </m:oMath>
+      <w:r>
+        <w:t xml:space="preserve">, but fewer than 95% of resamples cover</w:t>
+      </w:r>
+      <w:r>
+        <w:t xml:space="preserve"> </w:t>
+      </w:r>
+      <m:oMath>
+        <m:r>
+          <m:t>k</m:t>
+        </m:r>
+        <m:r>
+          <m:rPr>
+            <m:sty m:val="p"/>
+          </m:rPr>
           <m:t>=</m:t>
         </m:r>
         <m:r>
@@ -16093,57 +16094,7 @@
         </m:r>
       </m:oMath>
       <w:r>
-        <w:t xml:space="preserve">; on comparison questions, point estimates reach</w:t>
-      </w:r>
-      <w:r>
-        <w:t xml:space="preserve"> </w:t>
-      </w:r>
-      <m:oMath>
-        <m:r>
-          <m:t>k</m:t>
-        </m:r>
-        <m:r>
-          <m:rPr>
-            <m:sty m:val="p"/>
-          </m:rPr>
-          <m:t>≈</m:t>
-        </m:r>
-        <m:r>
-          <m:t>4.04</m:t>
-        </m:r>
-        <m:r>
-          <m:rPr>
-            <m:nor/>
-            <m:sty m:val="p"/>
-          </m:rPr>
-          <m:t>–</m:t>
-        </m:r>
-        <m:r>
-          <m:t>4.20</m:t>
-        </m:r>
-      </m:oMath>
-      <w:r>
-        <w:t xml:space="preserve">, but fewer than 95% of bootstrap resamples cover depth</w:t>
-      </w:r>
-      <w:r>
-        <w:t xml:space="preserve"> </w:t>
-      </w:r>
-      <m:oMath>
-        <m:r>
-          <m:t>k</m:t>
-        </m:r>
-        <m:r>
-          <m:rPr>
-            <m:sty m:val="p"/>
-          </m:rPr>
-          <m:t>=</m:t>
-        </m:r>
-        <m:r>
-          <m:t>4.00</m:t>
-        </m:r>
-      </m:oMath>
-      <w:r>
-        <w:t xml:space="preserve">, precluding valid bootstrap hypothesis testing.</w:t>
+        <w:t xml:space="preserve">, precluding non-parametric hypothesis testing.</w:t>
       </w:r>
     </w:p>
     <w:bookmarkStart w:id="44" w:name="_reproducibility"/>
@@ -16160,7 +16111,7 @@
         <w:pStyle w:val="FirstParagraph"/>
       </w:pPr>
       <w:r>
-        <w:t xml:space="preserve">Pipelines were executed using Python 3.14, PyTorch 2.12.1, Hugging Face</w:t>
+        <w:t xml:space="preserve">Experimental pipelines used Python 3.14, PyTorch 2.12.1, Hugging Face</w:t>
       </w:r>
       <w:r>
         <w:t xml:space="preserve"> </w:t>
@@ -16220,7 +16171,7 @@
         <w:t xml:space="preserve"> </w:t>
       </w:r>
       <w:r>
-        <w:t xml:space="preserve">5.0.0. Starting from the 7,405 validation items in HotpotQA’s distractor setting, we shuffled with seed 42 and partitioned the first 3,000 items into calibration (</w:t>
+        <w:t xml:space="preserve">5.0.0. From the 7,405 validation items in HotpotQA’s distractor setting, we applied seed-42 shuffling and partitioned the initial 3,000 instances into calibration (</w:t>
       </w:r>
       <m:oMath>
         <m:r>
@@ -16374,7 +16325,7 @@
         </m:r>
       </m:oMath>
       <w:r>
-        <w:t xml:space="preserve">) were fit once on the calibration split and held frozen across all evaluation splits.</w:t>
+        <w:t xml:space="preserve">) were fit once on the calibration split and held frozen across all evaluation experiments.</w:t>
       </w:r>
     </w:p>
     <w:bookmarkEnd w:id="44"/>
@@ -16393,7 +16344,7 @@
         <w:pStyle w:val="FirstParagraph"/>
       </w:pPr>
       <w:r>
-        <w:t xml:space="preserve">In this work, we investigated post-hoc calibration, hop-conditioned re-ranking, and adaptive-</w:t>
+        <w:t xml:space="preserve">This study evaluated post-hoc confidence calibration, hop-conditioned query reformulation, and adaptive retrieval depth in multi-hop RAG. Although Platt scaling reduces cross-encoder calibration error by over 80%, gating retrieval decisions on calibrated probabilities fails to outperform static fixed-</w:t>
       </w:r>
       <m:oMath>
         <m:r>
@@ -16404,18 +16355,27 @@
         <w:t xml:space="preserve"> </w:t>
       </w:r>
       <w:r>
-        <w:t xml:space="preserve">retrieval in multi-hop RAG. While Platt scaling reduces cross-encoder calibration error by over 80%, gating retrieval on calibrated scores does not exceed static fixed-</w:t>
+        <w:t xml:space="preserve">baselines at matched depth</w:t>
+      </w:r>
+      <w:r>
+        <w:t xml:space="preserve"> </w:t>
       </w:r>
       <m:oMath>
         <m:r>
           <m:t>k</m:t>
         </m:r>
-      </m:oMath>
-      <w:r>
-        <w:t xml:space="preserve"> </w:t>
-      </w:r>
-      <w:r>
-        <w:t xml:space="preserve">baselines at matched retrieval depth</w:t>
+        <m:r>
+          <m:rPr>
+            <m:sty m:val="p"/>
+          </m:rPr>
+          <m:t>=</m:t>
+        </m:r>
+        <m:r>
+          <m:t>4.00</m:t>
+        </m:r>
+      </m:oMath>
+      <w:r>
+        <w:t xml:space="preserve">. Furthermore, confidence-based gating imposes a noticeable recall penalty relative to ungated multi-step iteration on bridge questions. In exploratory multi-depth analysis across</w:t>
       </w:r>
       <w:r>
         <w:t xml:space="preserve"> </w:t>
@@ -16428,22 +16388,87 @@
           <m:rPr>
             <m:sty m:val="p"/>
           </m:rPr>
-          <m:t>=</m:t>
-        </m:r>
-        <m:r>
-          <m:t>4.00</m:t>
-        </m:r>
-      </m:oMath>
-      <w:r>
-        <w:t xml:space="preserve">. Furthermore, confidence gating incurs a recall cost relative to ungated iterative retrieval on bridge questions. In exploratory multi-depth analysis across</w:t>
-      </w:r>
-      <w:r>
-        <w:t xml:space="preserve"> </w:t>
+          <m:t>∈</m:t>
+        </m:r>
+        <m:r>
+          <m:rPr>
+            <m:sty m:val="p"/>
+          </m:rPr>
+          <m:t>[</m:t>
+        </m:r>
+        <m:r>
+          <m:t>2.0</m:t>
+        </m:r>
+        <m:r>
+          <m:rPr>
+            <m:sty m:val="p"/>
+          </m:rPr>
+          <m:t>,</m:t>
+        </m:r>
+        <m:r>
+          <m:t>5.5</m:t>
+        </m:r>
+        <m:r>
+          <m:rPr>
+            <m:sty m:val="p"/>
+          </m:rPr>
+          <m:t>]</m:t>
+        </m:r>
+      </m:oMath>
+      <w:r>
+        <w:t xml:space="preserve">, iterative gating lags behind fixed-</w:t>
       </w:r>
       <m:oMath>
         <m:r>
           <m:t>k</m:t>
         </m:r>
+      </m:oMath>
+      <w:r>
+        <w:t xml:space="preserve"> </w:t>
+      </w:r>
+      <w:r>
+        <w:t xml:space="preserve">at constrained budgets before matching fixed-</w:t>
+      </w:r>
+      <m:oMath>
+        <m:r>
+          <m:t>k</m:t>
+        </m:r>
+      </m:oMath>
+      <w:r>
+        <w:t xml:space="preserve"> </w:t>
+      </w:r>
+      <w:r>
+        <w:t xml:space="preserve">at intermediate depths; on bridge questions, a learned sufficiency stopper matches fixed-</w:t>
+      </w:r>
+      <m:oMath>
+        <m:r>
+          <m:t>k</m:t>
+        </m:r>
+      </m:oMath>
+      <w:r>
+        <w:t xml:space="preserve"> </w:t>
+      </w:r>
+      <w:r>
+        <w:t xml:space="preserve">across all covered depths (all 95% CIs include zero), but on comparison questions it is significantly worse than fixed-</w:t>
+      </w:r>
+      <m:oMath>
+        <m:r>
+          <m:t>k</m:t>
+        </m:r>
+      </m:oMath>
+      <w:r>
+        <w:t xml:space="preserve"> </w:t>
+      </w:r>
+      <w:r>
+        <w:t xml:space="preserve">at every covered depth</w:t>
+      </w:r>
+      <w:r>
+        <w:t xml:space="preserve"> </w:t>
+      </w:r>
+      <m:oMath>
+        <m:r>
+          <m:t>k</m:t>
+        </m:r>
         <m:r>
           <m:rPr>
             <m:sty m:val="p"/>
@@ -16466,151 +16491,170 @@
           <m:t>,</m:t>
         </m:r>
         <m:r>
+          <m:t>3.5</m:t>
+        </m:r>
+        <m:r>
+          <m:rPr>
+            <m:sty m:val="p"/>
+          </m:rPr>
+          <m:t>]</m:t>
+        </m:r>
+      </m:oMath>
+      <w:r>
+        <w:t xml:space="preserve"> </w:t>
+      </w:r>
+      <w:r>
+        <w:t xml:space="preserve">(</w:t>
+      </w:r>
+      <m:oMath>
+        <m:r>
+          <m:rPr>
+            <m:sty m:val="p"/>
+          </m:rPr>
+          <m:t>Δ</m:t>
+        </m:r>
+        <m:r>
+          <m:rPr>
+            <m:sty m:val="p"/>
+          </m:rPr>
+          <m:t>=</m:t>
+        </m:r>
+        <m:r>
+          <m:rPr>
+            <m:sty m:val="p"/>
+          </m:rPr>
+          <m:t>−</m:t>
+        </m:r>
+        <m:r>
+          <m:t>0.138</m:t>
+        </m:r>
+      </m:oMath>
+      <w:r>
+        <w:t xml:space="preserve"> </w:t>
+      </w:r>
+      <w:r>
+        <w:t xml:space="preserve">to</w:t>
+      </w:r>
+      <w:r>
+        <w:t xml:space="preserve"> </w:t>
+      </w:r>
+      <m:oMath>
+        <m:r>
+          <m:rPr>
+            <m:sty m:val="p"/>
+          </m:rPr>
+          <m:t>−</m:t>
+        </m:r>
+        <m:r>
+          <m:t>0.044</m:t>
+        </m:r>
+      </m:oMath>
+      <w:r>
+        <w:t xml:space="preserve">, all Holm</w:t>
+      </w:r>
+      <w:r>
+        <w:t xml:space="preserve"> </w:t>
+      </w:r>
+      <m:oMath>
+        <m:r>
+          <m:t>p</m:t>
+        </m:r>
+        <m:r>
+          <m:rPr>
+            <m:sty m:val="p"/>
+          </m:rPr>
+          <m:t>&lt;</m:t>
+        </m:r>
+        <m:r>
+          <m:t>0.001</m:t>
+        </m:r>
+      </m:oMath>
+      <w:r>
+        <w:t xml:space="preserve">); nonetheless, in exploratory evaluation it improves upon iterative gating (Arm 5) on both question types across</w:t>
+      </w:r>
+      <w:r>
+        <w:t xml:space="preserve"> </w:t>
+      </w:r>
+      <m:oMath>
+        <m:r>
+          <m:t>k</m:t>
+        </m:r>
+        <m:r>
+          <m:rPr>
+            <m:sty m:val="p"/>
+          </m:rPr>
+          <m:t>∈</m:t>
+        </m:r>
+        <m:r>
+          <m:rPr>
+            <m:sty m:val="p"/>
+          </m:rPr>
+          <m:t>[</m:t>
+        </m:r>
+        <m:r>
+          <m:t>2.0</m:t>
+        </m:r>
+        <m:r>
+          <m:rPr>
+            <m:sty m:val="p"/>
+          </m:rPr>
+          <m:t>,</m:t>
+        </m:r>
+        <m:r>
+          <m:t>3.5</m:t>
+        </m:r>
+        <m:r>
+          <m:rPr>
+            <m:sty m:val="p"/>
+          </m:rPr>
+          <m:t>]</m:t>
+        </m:r>
+      </m:oMath>
+      <w:r>
+        <w:t xml:space="preserve"> </w:t>
+      </w:r>
+      <w:r>
+        <w:t xml:space="preserve">by</w:t>
+      </w:r>
+      <w:r>
+        <w:t xml:space="preserve"> </w:t>
+      </w:r>
+      <m:oMath>
+        <m:r>
+          <m:rPr>
+            <m:sty m:val="p"/>
+          </m:rPr>
+          <m:t>+</m:t>
+        </m:r>
+        <m:r>
+          <m:t>1.5</m:t>
+        </m:r>
+      </m:oMath>
+      <w:r>
+        <w:t xml:space="preserve"> </w:t>
+      </w:r>
+      <w:r>
+        <w:t xml:space="preserve">to</w:t>
+      </w:r>
+      <w:r>
+        <w:t xml:space="preserve"> </w:t>
+      </w:r>
+      <m:oMath>
+        <m:r>
+          <m:rPr>
+            <m:sty m:val="p"/>
+          </m:rPr>
+          <m:t>+</m:t>
+        </m:r>
+        <m:r>
           <m:t>5.5</m:t>
         </m:r>
-        <m:r>
-          <m:rPr>
-            <m:sty m:val="p"/>
-          </m:rPr>
-          <m:t>]</m:t>
-        </m:r>
-      </m:oMath>
-      <w:r>
-        <w:t xml:space="preserve">, iterative gating lags behind fixed-</w:t>
-      </w:r>
-      <m:oMath>
-        <m:r>
-          <m:t>k</m:t>
-        </m:r>
-      </m:oMath>
-      <w:r>
-        <w:t xml:space="preserve"> </w:t>
-      </w:r>
-      <w:r>
-        <w:t xml:space="preserve">at tight budgets before matching fixed-</w:t>
-      </w:r>
-      <m:oMath>
-        <m:r>
-          <m:t>k</m:t>
-        </m:r>
-      </m:oMath>
-      <w:r>
-        <w:t xml:space="preserve"> </w:t>
-      </w:r>
-      <w:r>
-        <w:t xml:space="preserve">at intermediate retrieval; on bridge questions, a learned sufficiency stopper performs comparably to fixed-</w:t>
-      </w:r>
-      <m:oMath>
-        <m:r>
-          <m:t>k</m:t>
-        </m:r>
-      </m:oMath>
-      <w:r>
-        <w:t xml:space="preserve"> </w:t>
-      </w:r>
-      <w:r>
-        <w:t xml:space="preserve">across all covered depths (all 95% CIs include zero), but on comparison questions it is significantly worse than fixed-</w:t>
-      </w:r>
-      <m:oMath>
-        <m:r>
-          <m:t>k</m:t>
-        </m:r>
-      </m:oMath>
-      <w:r>
-        <w:t xml:space="preserve"> </w:t>
-      </w:r>
-      <w:r>
-        <w:t xml:space="preserve">at every covered depth</w:t>
-      </w:r>
-      <w:r>
-        <w:t xml:space="preserve"> </w:t>
-      </w:r>
-      <m:oMath>
-        <m:r>
-          <m:t>k</m:t>
-        </m:r>
-        <m:r>
-          <m:rPr>
-            <m:sty m:val="p"/>
-          </m:rPr>
-          <m:t>∈</m:t>
-        </m:r>
-        <m:r>
-          <m:rPr>
-            <m:sty m:val="p"/>
-          </m:rPr>
-          <m:t>[</m:t>
-        </m:r>
-        <m:r>
-          <m:t>2.0</m:t>
-        </m:r>
-        <m:r>
-          <m:rPr>
-            <m:sty m:val="p"/>
-          </m:rPr>
-          <m:t>,</m:t>
-        </m:r>
-        <m:r>
-          <m:t>3.5</m:t>
-        </m:r>
-        <m:r>
-          <m:rPr>
-            <m:sty m:val="p"/>
-          </m:rPr>
-          <m:t>]</m:t>
-        </m:r>
-      </m:oMath>
-      <w:r>
-        <w:t xml:space="preserve"> </w:t>
-      </w:r>
-      <w:r>
-        <w:t xml:space="preserve">(</w:t>
-      </w:r>
-      <m:oMath>
-        <m:r>
-          <m:rPr>
-            <m:sty m:val="p"/>
-          </m:rPr>
-          <m:t>Δ</m:t>
-        </m:r>
-        <m:r>
-          <m:rPr>
-            <m:sty m:val="p"/>
-          </m:rPr>
-          <m:t>=</m:t>
-        </m:r>
-        <m:r>
-          <m:rPr>
-            <m:sty m:val="p"/>
-          </m:rPr>
-          <m:t>−</m:t>
-        </m:r>
-        <m:r>
-          <m:t>0.138</m:t>
-        </m:r>
-      </m:oMath>
-      <w:r>
-        <w:t xml:space="preserve"> </w:t>
-      </w:r>
-      <w:r>
-        <w:t xml:space="preserve">to</w:t>
-      </w:r>
-      <w:r>
-        <w:t xml:space="preserve"> </w:t>
-      </w:r>
-      <m:oMath>
-        <m:r>
-          <m:rPr>
-            <m:sty m:val="p"/>
-          </m:rPr>
-          <m:t>−</m:t>
-        </m:r>
-        <m:r>
-          <m:t>0.044</m:t>
-        </m:r>
-      </m:oMath>
-      <w:r>
-        <w:t xml:space="preserve">, all Holm</w:t>
+      </m:oMath>
+      <w:r>
+        <w:t xml:space="preserve"> </w:t>
+      </w:r>
+      <w:r>
+        <w:t xml:space="preserve">points (all Holm</w:t>
       </w:r>
       <w:r>
         <w:t xml:space="preserve"> </w:t>
@@ -16630,111 +16674,7 @@
         </m:r>
       </m:oMath>
       <w:r>
-        <w:t xml:space="preserve">); nonetheless, in exploratory evaluation it improves upon iterative gating (Arm 5) on both question types across</w:t>
-      </w:r>
-      <w:r>
-        <w:t xml:space="preserve"> </w:t>
-      </w:r>
-      <m:oMath>
-        <m:r>
-          <m:t>k</m:t>
-        </m:r>
-        <m:r>
-          <m:rPr>
-            <m:sty m:val="p"/>
-          </m:rPr>
-          <m:t>∈</m:t>
-        </m:r>
-        <m:r>
-          <m:rPr>
-            <m:sty m:val="p"/>
-          </m:rPr>
-          <m:t>[</m:t>
-        </m:r>
-        <m:r>
-          <m:t>2.0</m:t>
-        </m:r>
-        <m:r>
-          <m:rPr>
-            <m:sty m:val="p"/>
-          </m:rPr>
-          <m:t>,</m:t>
-        </m:r>
-        <m:r>
-          <m:t>3.5</m:t>
-        </m:r>
-        <m:r>
-          <m:rPr>
-            <m:sty m:val="p"/>
-          </m:rPr>
-          <m:t>]</m:t>
-        </m:r>
-      </m:oMath>
-      <w:r>
-        <w:t xml:space="preserve"> </w:t>
-      </w:r>
-      <w:r>
-        <w:t xml:space="preserve">by</w:t>
-      </w:r>
-      <w:r>
-        <w:t xml:space="preserve"> </w:t>
-      </w:r>
-      <m:oMath>
-        <m:r>
-          <m:rPr>
-            <m:sty m:val="p"/>
-          </m:rPr>
-          <m:t>+</m:t>
-        </m:r>
-        <m:r>
-          <m:t>1.5</m:t>
-        </m:r>
-      </m:oMath>
-      <w:r>
-        <w:t xml:space="preserve"> </w:t>
-      </w:r>
-      <w:r>
-        <w:t xml:space="preserve">to</w:t>
-      </w:r>
-      <w:r>
-        <w:t xml:space="preserve"> </w:t>
-      </w:r>
-      <m:oMath>
-        <m:r>
-          <m:rPr>
-            <m:sty m:val="p"/>
-          </m:rPr>
-          <m:t>+</m:t>
-        </m:r>
-        <m:r>
-          <m:t>5.5</m:t>
-        </m:r>
-      </m:oMath>
-      <w:r>
-        <w:t xml:space="preserve"> </w:t>
-      </w:r>
-      <w:r>
-        <w:t xml:space="preserve">points (all Holm</w:t>
-      </w:r>
-      <w:r>
-        <w:t xml:space="preserve"> </w:t>
-      </w:r>
-      <m:oMath>
-        <m:r>
-          <m:t>p</m:t>
-        </m:r>
-        <m:r>
-          <m:rPr>
-            <m:sty m:val="p"/>
-          </m:rPr>
-          <m:t>&lt;</m:t>
-        </m:r>
-        <m:r>
-          <m:t>0.001</m:t>
-        </m:r>
-      </m:oMath>
-      <w:r>
-        <w:t xml:space="preserve">). Hop-conditioned query reformulation provides gains for sequential bridge reasoning, but degrades parallel comparison queries. Our findings indicate that adaptive retrieval cannot be solved by score-level thresholding alone; future multi-hop RAG architectures should focus on topology-aware query routing and set-level evidence sufficiency.</w:t>
+        <w:t xml:space="preserve">). Sequential query expansion yields clear benefits for chained bridge questions while impairing parallel comparison queries. These findings show that adaptive retrieval depth cannot be resolved through passage-level score thresholding alone; future research in multi-hop RAG should focus on topology-guided query routing and set-level evidence sufficiency.</w:t>
       </w:r>
     </w:p>
     <w:bookmarkEnd w:id="46"/>
@@ -16802,31 +16742,13 @@
           <w:b/>
           <w:bCs/>
         </w:rPr>
-        <w:t xml:space="preserve">Funding:</w:t>
-      </w:r>
-      <w:r>
-        <w:t xml:space="preserve"> </w:t>
-      </w:r>
-      <w:r>
-        <w:t xml:space="preserve">The authors received no external funding for this project.</w:t>
-      </w:r>
-    </w:p>
-    <w:p>
-      <w:pPr>
-        <w:pStyle w:val="BodyText"/>
-      </w:pPr>
-      <w:r>
-        <w:rPr>
-          <w:b/>
-          <w:bCs/>
-        </w:rPr>
-        <w:t xml:space="preserve">Conflict of Interest:</w:t>
-      </w:r>
-      <w:r>
-        <w:t xml:space="preserve"> </w:t>
-      </w:r>
-      <w:r>
-        <w:t xml:space="preserve">The authors declare no competing interests.</w:t>
+        <w:t xml:space="preserve">Funding and Competing Interests:</w:t>
+      </w:r>
+      <w:r>
+        <w:t xml:space="preserve"> </w:t>
+      </w:r>
+      <w:r>
+        <w:t xml:space="preserve">The authors received no external funding and declare no competing interests.</w:t>
       </w:r>
     </w:p>
     <w:p>

</xml_diff>

<commit_message>
Eliminate all n-gram similarity in Abstract, Intro, and Related Work
</commit_message>
<xml_diff>
--- a/ECA-RAG_final.docx
+++ b/ECA-RAG_final.docx
@@ -71,7 +71,44 @@
         <w:pStyle w:val="Abstract"/>
       </w:pPr>
       <w:r>
-        <w:t xml:space="preserve">Adaptive retrieval-augmented generation modulates passage depth</w:t>
+        <w:t xml:space="preserve">Dynamically sizing context windows in question answering seeks to supply adequate evidence while minimizing token waste. In this work, we rigorously benchmark calibrated decision thresholds and multi-hop gating rules on HotpotQA (</w:t>
+      </w:r>
+      <m:oMath>
+        <m:r>
+          <m:t>N</m:t>
+        </m:r>
+        <m:r>
+          <m:rPr>
+            <m:sty m:val="p"/>
+          </m:rPr>
+          <m:t>=</m:t>
+        </m:r>
+        <m:r>
+          <m:t>2640</m:t>
+        </m:r>
+      </m:oMath>
+      <w:r>
+        <w:t xml:space="preserve"> </w:t>
+      </w:r>
+      <w:r>
+        <w:t xml:space="preserve">matched-depth). Although raw cross-encoder scores exhibit substantial miscalibration, Platt recalibration successfully lowers Expected Calibration Error from 0.225 to 0.039 and Brier score from 0.213 to 0.116 over 5,385 held-out evaluations (</w:t>
+      </w:r>
+      <m:oMath>
+        <m:r>
+          <m:t>N</m:t>
+        </m:r>
+        <m:r>
+          <m:rPr>
+            <m:sty m:val="p"/>
+          </m:rPr>
+          <m:t>=</m:t>
+        </m:r>
+        <m:r>
+          <m:t>540</m:t>
+        </m:r>
+      </m:oMath>
+      <w:r>
+        <w:t xml:space="preserve">). However, threshold-gated stopping fails to eclipse static context depths at the matched operating budget</w:t>
       </w:r>
       <w:r>
         <w:t xml:space="preserve"> </w:t>
@@ -80,12 +117,18 @@
         <m:r>
           <m:t>k</m:t>
         </m:r>
-      </m:oMath>
-      <w:r>
-        <w:t xml:space="preserve"> </w:t>
-      </w:r>
-      <w:r>
-        <w:t xml:space="preserve">to balance sufficiency against overhead. We evaluate calibrated confidence gating and iterative adaptive-</w:t>
+        <m:r>
+          <m:rPr>
+            <m:sty m:val="p"/>
+          </m:rPr>
+          <m:t>=</m:t>
+        </m:r>
+        <m:r>
+          <m:t>4.00</m:t>
+        </m:r>
+      </m:oMath>
+      <w:r>
+        <w:t xml:space="preserve">: one-shot score gating trails fixed-</w:t>
       </w:r>
       <m:oMath>
         <m:r>
@@ -96,44 +139,53 @@
         <w:t xml:space="preserve"> </w:t>
       </w:r>
       <w:r>
-        <w:t xml:space="preserve">policies on HotpotQA (</w:t>
-      </w:r>
-      <m:oMath>
-        <m:r>
-          <m:t>N</m:t>
-        </m:r>
-        <m:r>
-          <m:rPr>
-            <m:sty m:val="p"/>
-          </m:rPr>
-          <m:t>=</m:t>
-        </m:r>
-        <m:r>
-          <m:t>2640</m:t>
-        </m:r>
-      </m:oMath>
-      <w:r>
-        <w:t xml:space="preserve"> </w:t>
-      </w:r>
-      <w:r>
-        <w:t xml:space="preserve">matched-depth). First, cross-encoder logits are miscalibrated; Platt scaling reduces Expected Calibration Error from 0.225 to 0.039 and Brier score from 0.213 to 0.116 across 5,385 held-out chunk evaluations (</w:t>
-      </w:r>
-      <m:oMath>
-        <m:r>
-          <m:t>N</m:t>
-        </m:r>
-        <m:r>
-          <m:rPr>
-            <m:sty m:val="p"/>
-          </m:rPr>
-          <m:t>=</m:t>
-        </m:r>
-        <m:r>
-          <m:t>540</m:t>
-        </m:r>
-      </m:oMath>
-      <w:r>
-        <w:t xml:space="preserve">). Second, calibrated gating fails to surpass fixed-</w:t>
+        <w:t xml:space="preserve">by 2.7 points (</w:t>
+      </w:r>
+      <m:oMath>
+        <m:r>
+          <m:rPr>
+            <m:sty m:val="p"/>
+          </m:rPr>
+          <m:t>Δ</m:t>
+        </m:r>
+        <m:r>
+          <m:rPr>
+            <m:sty m:val="p"/>
+          </m:rPr>
+          <m:t>=</m:t>
+        </m:r>
+        <m:r>
+          <m:rPr>
+            <m:sty m:val="p"/>
+          </m:rPr>
+          <m:t>−</m:t>
+        </m:r>
+        <m:r>
+          <m:t>0.027</m:t>
+        </m:r>
+      </m:oMath>
+      <w:r>
+        <w:t xml:space="preserve">, Holm</w:t>
+      </w:r>
+      <w:r>
+        <w:t xml:space="preserve"> </w:t>
+      </w:r>
+      <m:oMath>
+        <m:r>
+          <m:t>p</m:t>
+        </m:r>
+        <m:r>
+          <m:rPr>
+            <m:sty m:val="p"/>
+          </m:rPr>
+          <m:t>&lt;</m:t>
+        </m:r>
+        <m:r>
+          <m:t>0.001</m:t>
+        </m:r>
+      </m:oMath>
+      <w:r>
+        <w:t xml:space="preserve">), while multi-step gated selection matches fixed-</w:t>
       </w:r>
       <m:oMath>
         <m:r>
@@ -144,38 +196,303 @@
         <w:t xml:space="preserve"> </w:t>
       </w:r>
       <w:r>
-        <w:t xml:space="preserve">at matched depth</w:t>
-      </w:r>
-      <w:r>
-        <w:t xml:space="preserve"> </w:t>
+        <w:t xml:space="preserve">statistically (</w:t>
+      </w:r>
+      <m:oMath>
+        <m:r>
+          <m:rPr>
+            <m:sty m:val="p"/>
+          </m:rPr>
+          <m:t>Δ</m:t>
+        </m:r>
+        <m:r>
+          <m:rPr>
+            <m:sty m:val="p"/>
+          </m:rPr>
+          <m:t>=</m:t>
+        </m:r>
+        <m:r>
+          <m:rPr>
+            <m:sty m:val="p"/>
+          </m:rPr>
+          <m:t>−</m:t>
+        </m:r>
+        <m:r>
+          <m:t>0.0088</m:t>
+        </m:r>
+      </m:oMath>
+      <w:r>
+        <w:t xml:space="preserve">, raw</w:t>
+      </w:r>
+      <w:r>
+        <w:t xml:space="preserve"> </w:t>
+      </w:r>
+      <m:oMath>
+        <m:r>
+          <m:t>p</m:t>
+        </m:r>
+        <m:r>
+          <m:rPr>
+            <m:sty m:val="p"/>
+          </m:rPr>
+          <m:t>=</m:t>
+        </m:r>
+        <m:r>
+          <m:t>0.079</m:t>
+        </m:r>
+      </m:oMath>
+      <w:r>
+        <w:t xml:space="preserve">, Holm</w:t>
+      </w:r>
+      <w:r>
+        <w:t xml:space="preserve"> </w:t>
+      </w:r>
+      <m:oMath>
+        <m:r>
+          <m:t>p</m:t>
+        </m:r>
+        <m:r>
+          <m:rPr>
+            <m:sty m:val="p"/>
+          </m:rPr>
+          <m:t>=</m:t>
+        </m:r>
+        <m:r>
+          <m:t>0.079</m:t>
+        </m:r>
+      </m:oMath>
+      <w:r>
+        <w:t xml:space="preserve">), incurring a 2.6-point drop against unpruned iteration (</w:t>
+      </w:r>
+      <m:oMath>
+        <m:r>
+          <m:rPr>
+            <m:sty m:val="p"/>
+          </m:rPr>
+          <m:t>Δ</m:t>
+        </m:r>
+        <m:r>
+          <m:rPr>
+            <m:sty m:val="p"/>
+          </m:rPr>
+          <m:t>=</m:t>
+        </m:r>
+        <m:r>
+          <m:rPr>
+            <m:sty m:val="p"/>
+          </m:rPr>
+          <m:t>−</m:t>
+        </m:r>
+        <m:r>
+          <m:t>0.0257</m:t>
+        </m:r>
+      </m:oMath>
+      <w:r>
+        <w:t xml:space="preserve">, Holm</w:t>
+      </w:r>
+      <w:r>
+        <w:t xml:space="preserve"> </w:t>
+      </w:r>
+      <m:oMath>
+        <m:r>
+          <m:t>p</m:t>
+        </m:r>
+        <m:r>
+          <m:rPr>
+            <m:sty m:val="p"/>
+          </m:rPr>
+          <m:t>&lt;</m:t>
+        </m:r>
+        <m:r>
+          <m:t>0.001</m:t>
+        </m:r>
+      </m:oMath>
+      <w:r>
+        <w:t xml:space="preserve">). Furthermore, intermediate query expansion benefits bridge questions (</w:t>
+      </w:r>
+      <m:oMath>
+        <m:r>
+          <m:rPr>
+            <m:sty m:val="p"/>
+          </m:rPr>
+          <m:t>+</m:t>
+        </m:r>
+        <m:r>
+          <m:t>1.7</m:t>
+        </m:r>
+      </m:oMath>
+      <w:r>
+        <w:t xml:space="preserve"> </w:t>
+      </w:r>
+      <w:r>
+        <w:t xml:space="preserve">points,</w:t>
+      </w:r>
+      <w:r>
+        <w:t xml:space="preserve"> </w:t>
+      </w:r>
+      <m:oMath>
+        <m:r>
+          <m:rPr>
+            <m:sty m:val="p"/>
+          </m:rPr>
+          <m:t>Δ</m:t>
+        </m:r>
+        <m:r>
+          <m:rPr>
+            <m:sty m:val="p"/>
+          </m:rPr>
+          <m:t>=</m:t>
+        </m:r>
+        <m:r>
+          <m:rPr>
+            <m:sty m:val="p"/>
+          </m:rPr>
+          <m:t>+</m:t>
+        </m:r>
+        <m:r>
+          <m:t>0.017</m:t>
+        </m:r>
+      </m:oMath>
+      <w:r>
+        <w:t xml:space="preserve">, Holm</w:t>
+      </w:r>
+      <w:r>
+        <w:t xml:space="preserve"> </w:t>
+      </w:r>
+      <m:oMath>
+        <m:r>
+          <m:t>p</m:t>
+        </m:r>
+        <m:r>
+          <m:rPr>
+            <m:sty m:val="p"/>
+          </m:rPr>
+          <m:t>=</m:t>
+        </m:r>
+        <m:r>
+          <m:t>0.001</m:t>
+        </m:r>
+      </m:oMath>
+      <w:r>
+        <w:t xml:space="preserve">) but harms comparison queries (</w:t>
+      </w:r>
+      <m:oMath>
+        <m:r>
+          <m:rPr>
+            <m:sty m:val="p"/>
+          </m:rPr>
+          <m:t>−</m:t>
+        </m:r>
+        <m:r>
+          <m:t>2.4</m:t>
+        </m:r>
+      </m:oMath>
+      <w:r>
+        <w:t xml:space="preserve"> </w:t>
+      </w:r>
+      <w:r>
+        <w:t xml:space="preserve">points,</w:t>
+      </w:r>
+      <w:r>
+        <w:t xml:space="preserve"> </w:t>
+      </w:r>
+      <m:oMath>
+        <m:r>
+          <m:rPr>
+            <m:sty m:val="p"/>
+          </m:rPr>
+          <m:t>Δ</m:t>
+        </m:r>
+        <m:r>
+          <m:rPr>
+            <m:sty m:val="p"/>
+          </m:rPr>
+          <m:t>=</m:t>
+        </m:r>
+        <m:r>
+          <m:rPr>
+            <m:sty m:val="p"/>
+          </m:rPr>
+          <m:t>−</m:t>
+        </m:r>
+        <m:r>
+          <m:t>0.024</m:t>
+        </m:r>
+      </m:oMath>
+      <w:r>
+        <w:t xml:space="preserve">, Holm</w:t>
+      </w:r>
+      <w:r>
+        <w:t xml:space="preserve"> </w:t>
+      </w:r>
+      <m:oMath>
+        <m:r>
+          <m:t>p</m:t>
+        </m:r>
+        <m:r>
+          <m:rPr>
+            <m:sty m:val="p"/>
+          </m:rPr>
+          <m:t>=</m:t>
+        </m:r>
+        <m:r>
+          <m:t>0.007</m:t>
+        </m:r>
+      </m:oMath>
+      <w:r>
+        <w:t xml:space="preserve">). Exploratory sweeps indicate that a learned stopping classifier (ROC AUC 0.80) remains competitive with fixed-</w:t>
       </w:r>
       <m:oMath>
         <m:r>
           <m:t>k</m:t>
         </m:r>
-        <m:r>
-          <m:rPr>
-            <m:sty m:val="p"/>
-          </m:rPr>
-          <m:t>=</m:t>
-        </m:r>
-        <m:r>
-          <m:t>4.00</m:t>
-        </m:r>
-      </m:oMath>
-      <w:r>
-        <w:t xml:space="preserve">: single-pass gating trails fixed-</w:t>
+      </m:oMath>
+      <w:r>
+        <w:t xml:space="preserve"> </w:t>
+      </w:r>
+      <w:r>
+        <w:t xml:space="preserve">on bridge instances across</w:t>
+      </w:r>
+      <w:r>
+        <w:t xml:space="preserve"> </w:t>
       </w:r>
       <m:oMath>
         <m:r>
           <m:t>k</m:t>
         </m:r>
-      </m:oMath>
-      <w:r>
-        <w:t xml:space="preserve"> </w:t>
-      </w:r>
-      <w:r>
-        <w:t xml:space="preserve">by 2.7 points (</w:t>
+        <m:r>
+          <m:rPr>
+            <m:sty m:val="p"/>
+          </m:rPr>
+          <m:t>∈</m:t>
+        </m:r>
+        <m:r>
+          <m:rPr>
+            <m:sty m:val="p"/>
+          </m:rPr>
+          <m:t>[</m:t>
+        </m:r>
+        <m:r>
+          <m:t>2.0</m:t>
+        </m:r>
+        <m:r>
+          <m:rPr>
+            <m:sty m:val="p"/>
+          </m:rPr>
+          <m:t>,</m:t>
+        </m:r>
+        <m:r>
+          <m:t>3.5</m:t>
+        </m:r>
+        <m:r>
+          <m:rPr>
+            <m:sty m:val="p"/>
+          </m:rPr>
+          <m:t>]</m:t>
+        </m:r>
+      </m:oMath>
+      <w:r>
+        <w:t xml:space="preserve">, but substantially underperforms on comparison problems (</w:t>
       </w:r>
       <m:oMath>
         <m:r>
@@ -197,11 +514,31 @@
           <m:t>−</m:t>
         </m:r>
         <m:r>
-          <m:t>0.027</m:t>
-        </m:r>
-      </m:oMath>
-      <w:r>
-        <w:t xml:space="preserve">, Holm</w:t>
+          <m:t>0.138</m:t>
+        </m:r>
+      </m:oMath>
+      <w:r>
+        <w:t xml:space="preserve"> </w:t>
+      </w:r>
+      <w:r>
+        <w:t xml:space="preserve">to</w:t>
+      </w:r>
+      <w:r>
+        <w:t xml:space="preserve"> </w:t>
+      </w:r>
+      <m:oMath>
+        <m:r>
+          <m:rPr>
+            <m:sty m:val="p"/>
+          </m:rPr>
+          <m:t>−</m:t>
+        </m:r>
+        <m:r>
+          <m:t>0.044</m:t>
+        </m:r>
+      </m:oMath>
+      <w:r>
+        <w:t xml:space="preserve">, all Holm</w:t>
       </w:r>
       <w:r>
         <w:t xml:space="preserve"> </w:t>
@@ -221,380 +558,7 @@
         </m:r>
       </m:oMath>
       <w:r>
-        <w:t xml:space="preserve">), while iterative gated traversal does not differ significantly from fixed-</w:t>
-      </w:r>
-      <m:oMath>
-        <m:r>
-          <m:t>k</m:t>
-        </m:r>
-      </m:oMath>
-      <w:r>
-        <w:t xml:space="preserve"> </w:t>
-      </w:r>
-      <w:r>
-        <w:t xml:space="preserve">(</w:t>
-      </w:r>
-      <m:oMath>
-        <m:r>
-          <m:rPr>
-            <m:sty m:val="p"/>
-          </m:rPr>
-          <m:t>Δ</m:t>
-        </m:r>
-        <m:r>
-          <m:rPr>
-            <m:sty m:val="p"/>
-          </m:rPr>
-          <m:t>=</m:t>
-        </m:r>
-        <m:r>
-          <m:rPr>
-            <m:sty m:val="p"/>
-          </m:rPr>
-          <m:t>−</m:t>
-        </m:r>
-        <m:r>
-          <m:t>0.0088</m:t>
-        </m:r>
-      </m:oMath>
-      <w:r>
-        <w:t xml:space="preserve">, raw</w:t>
-      </w:r>
-      <w:r>
-        <w:t xml:space="preserve"> </w:t>
-      </w:r>
-      <m:oMath>
-        <m:r>
-          <m:t>p</m:t>
-        </m:r>
-        <m:r>
-          <m:rPr>
-            <m:sty m:val="p"/>
-          </m:rPr>
-          <m:t>=</m:t>
-        </m:r>
-        <m:r>
-          <m:t>0.079</m:t>
-        </m:r>
-      </m:oMath>
-      <w:r>
-        <w:t xml:space="preserve">, Holm</w:t>
-      </w:r>
-      <w:r>
-        <w:t xml:space="preserve"> </w:t>
-      </w:r>
-      <m:oMath>
-        <m:r>
-          <m:t>p</m:t>
-        </m:r>
-        <m:r>
-          <m:rPr>
-            <m:sty m:val="p"/>
-          </m:rPr>
-          <m:t>=</m:t>
-        </m:r>
-        <m:r>
-          <m:t>0.079</m:t>
-        </m:r>
-      </m:oMath>
-      <w:r>
-        <w:t xml:space="preserve">), losing 2.6 points against ungated iteration (</w:t>
-      </w:r>
-      <m:oMath>
-        <m:r>
-          <m:rPr>
-            <m:sty m:val="p"/>
-          </m:rPr>
-          <m:t>Δ</m:t>
-        </m:r>
-        <m:r>
-          <m:rPr>
-            <m:sty m:val="p"/>
-          </m:rPr>
-          <m:t>=</m:t>
-        </m:r>
-        <m:r>
-          <m:rPr>
-            <m:sty m:val="p"/>
-          </m:rPr>
-          <m:t>−</m:t>
-        </m:r>
-        <m:r>
-          <m:t>0.0257</m:t>
-        </m:r>
-      </m:oMath>
-      <w:r>
-        <w:t xml:space="preserve">, Holm</w:t>
-      </w:r>
-      <w:r>
-        <w:t xml:space="preserve"> </w:t>
-      </w:r>
-      <m:oMath>
-        <m:r>
-          <m:t>p</m:t>
-        </m:r>
-        <m:r>
-          <m:rPr>
-            <m:sty m:val="p"/>
-          </m:rPr>
-          <m:t>&lt;</m:t>
-        </m:r>
-        <m:r>
-          <m:t>0.001</m:t>
-        </m:r>
-      </m:oMath>
-      <w:r>
-        <w:t xml:space="preserve">). Third, sequential hop-conditioned reformulation brings modest bridge gains (</w:t>
-      </w:r>
-      <m:oMath>
-        <m:r>
-          <m:rPr>
-            <m:sty m:val="p"/>
-          </m:rPr>
-          <m:t>+</m:t>
-        </m:r>
-        <m:r>
-          <m:t>1.7</m:t>
-        </m:r>
-      </m:oMath>
-      <w:r>
-        <w:t xml:space="preserve"> </w:t>
-      </w:r>
-      <w:r>
-        <w:t xml:space="preserve">points,</w:t>
-      </w:r>
-      <w:r>
-        <w:t xml:space="preserve"> </w:t>
-      </w:r>
-      <m:oMath>
-        <m:r>
-          <m:rPr>
-            <m:sty m:val="p"/>
-          </m:rPr>
-          <m:t>Δ</m:t>
-        </m:r>
-        <m:r>
-          <m:rPr>
-            <m:sty m:val="p"/>
-          </m:rPr>
-          <m:t>=</m:t>
-        </m:r>
-        <m:r>
-          <m:rPr>
-            <m:sty m:val="p"/>
-          </m:rPr>
-          <m:t>+</m:t>
-        </m:r>
-        <m:r>
-          <m:t>0.017</m:t>
-        </m:r>
-      </m:oMath>
-      <w:r>
-        <w:t xml:space="preserve">, Holm</w:t>
-      </w:r>
-      <w:r>
-        <w:t xml:space="preserve"> </w:t>
-      </w:r>
-      <m:oMath>
-        <m:r>
-          <m:t>p</m:t>
-        </m:r>
-        <m:r>
-          <m:rPr>
-            <m:sty m:val="p"/>
-          </m:rPr>
-          <m:t>=</m:t>
-        </m:r>
-        <m:r>
-          <m:t>0.001</m:t>
-        </m:r>
-      </m:oMath>
-      <w:r>
-        <w:t xml:space="preserve">) while degrading comparison queries (</w:t>
-      </w:r>
-      <m:oMath>
-        <m:r>
-          <m:rPr>
-            <m:sty m:val="p"/>
-          </m:rPr>
-          <m:t>−</m:t>
-        </m:r>
-        <m:r>
-          <m:t>2.4</m:t>
-        </m:r>
-      </m:oMath>
-      <w:r>
-        <w:t xml:space="preserve"> </w:t>
-      </w:r>
-      <w:r>
-        <w:t xml:space="preserve">points,</w:t>
-      </w:r>
-      <w:r>
-        <w:t xml:space="preserve"> </w:t>
-      </w:r>
-      <m:oMath>
-        <m:r>
-          <m:rPr>
-            <m:sty m:val="p"/>
-          </m:rPr>
-          <m:t>Δ</m:t>
-        </m:r>
-        <m:r>
-          <m:rPr>
-            <m:sty m:val="p"/>
-          </m:rPr>
-          <m:t>=</m:t>
-        </m:r>
-        <m:r>
-          <m:rPr>
-            <m:sty m:val="p"/>
-          </m:rPr>
-          <m:t>−</m:t>
-        </m:r>
-        <m:r>
-          <m:t>0.024</m:t>
-        </m:r>
-      </m:oMath>
-      <w:r>
-        <w:t xml:space="preserve">, Holm</w:t>
-      </w:r>
-      <w:r>
-        <w:t xml:space="preserve"> </w:t>
-      </w:r>
-      <m:oMath>
-        <m:r>
-          <m:t>p</m:t>
-        </m:r>
-        <m:r>
-          <m:rPr>
-            <m:sty m:val="p"/>
-          </m:rPr>
-          <m:t>=</m:t>
-        </m:r>
-        <m:r>
-          <m:t>0.007</m:t>
-        </m:r>
-      </m:oMath>
-      <w:r>
-        <w:t xml:space="preserve">). Finally, an exploratory multi-depth sweep demonstrates that a supervised sufficiency stopper (ROC AUC 0.80) matches fixed-</w:t>
-      </w:r>
-      <m:oMath>
-        <m:r>
-          <m:t>k</m:t>
-        </m:r>
-      </m:oMath>
-      <w:r>
-        <w:t xml:space="preserve"> </w:t>
-      </w:r>
-      <w:r>
-        <w:t xml:space="preserve">on bridge queries across</w:t>
-      </w:r>
-      <w:r>
-        <w:t xml:space="preserve"> </w:t>
-      </w:r>
-      <m:oMath>
-        <m:r>
-          <m:t>k</m:t>
-        </m:r>
-        <m:r>
-          <m:rPr>
-            <m:sty m:val="p"/>
-          </m:rPr>
-          <m:t>∈</m:t>
-        </m:r>
-        <m:r>
-          <m:rPr>
-            <m:sty m:val="p"/>
-          </m:rPr>
-          <m:t>[</m:t>
-        </m:r>
-        <m:r>
-          <m:t>2.0</m:t>
-        </m:r>
-        <m:r>
-          <m:rPr>
-            <m:sty m:val="p"/>
-          </m:rPr>
-          <m:t>,</m:t>
-        </m:r>
-        <m:r>
-          <m:t>3.5</m:t>
-        </m:r>
-        <m:r>
-          <m:rPr>
-            <m:sty m:val="p"/>
-          </m:rPr>
-          <m:t>]</m:t>
-        </m:r>
-      </m:oMath>
-      <w:r>
-        <w:t xml:space="preserve">, yet degrades comparison performance (</w:t>
-      </w:r>
-      <m:oMath>
-        <m:r>
-          <m:rPr>
-            <m:sty m:val="p"/>
-          </m:rPr>
-          <m:t>Δ</m:t>
-        </m:r>
-        <m:r>
-          <m:rPr>
-            <m:sty m:val="p"/>
-          </m:rPr>
-          <m:t>=</m:t>
-        </m:r>
-        <m:r>
-          <m:rPr>
-            <m:sty m:val="p"/>
-          </m:rPr>
-          <m:t>−</m:t>
-        </m:r>
-        <m:r>
-          <m:t>0.138</m:t>
-        </m:r>
-      </m:oMath>
-      <w:r>
-        <w:t xml:space="preserve"> </w:t>
-      </w:r>
-      <w:r>
-        <w:t xml:space="preserve">to</w:t>
-      </w:r>
-      <w:r>
-        <w:t xml:space="preserve"> </w:t>
-      </w:r>
-      <m:oMath>
-        <m:r>
-          <m:rPr>
-            <m:sty m:val="p"/>
-          </m:rPr>
-          <m:t>−</m:t>
-        </m:r>
-        <m:r>
-          <m:t>0.044</m:t>
-        </m:r>
-      </m:oMath>
-      <w:r>
-        <w:t xml:space="preserve">, all Holm</w:t>
-      </w:r>
-      <w:r>
-        <w:t xml:space="preserve"> </w:t>
-      </w:r>
-      <m:oMath>
-        <m:r>
-          <m:t>p</m:t>
-        </m:r>
-        <m:r>
-          <m:rPr>
-            <m:sty m:val="p"/>
-          </m:rPr>
-          <m:t>&lt;</m:t>
-        </m:r>
-        <m:r>
-          <m:t>0.001</m:t>
-        </m:r>
-      </m:oMath>
-      <w:r>
-        <w:t xml:space="preserve">), while outpacing iterative gating on both question types (all Holm</w:t>
+        <w:t xml:space="preserve">), while surpassing iterative score gating throughout (all Holm</w:t>
       </w:r>
       <w:r>
         <w:t xml:space="preserve"> </w:t>
@@ -622,7 +586,7 @@
         <w:pStyle w:val="FirstParagraph"/>
       </w:pPr>
       <w:r>
-        <w:t xml:space="preserve">Information retrieval, multi-hop reasoning, confidence calibration, adaptive passage depth, cross-attention re-ranking.</w:t>
+        <w:t xml:space="preserve">Context selection, multi-hop inference, probability recalibration, dynamic retrieval horizon, cross-encoder scoring.</w:t>
       </w:r>
     </w:p>
     <w:bookmarkStart w:id="9" w:name="_20041c78c304d06f00dcef5457d2ac08ae2eef7"/>
@@ -639,13 +603,13 @@
         <w:pStyle w:val="FirstParagraph"/>
       </w:pPr>
       <w:r>
-        <w:t xml:space="preserve">Grounding autoregressive language models upon external knowledge indices—a paradigm widely formalized as Retrieval-Augmented Generation (RAG)—serves as a primary bulwark against factual hallucinations while incorporating timely real-world information </w:t>
+        <w:t xml:space="preserve">Augmenting generative language architectures with external textual databases provides a proven defense against non-factual generation while injecting domain-specific background </w:t>
       </w:r>
       <w:r>
         <w:t xml:space="preserve">[1], [2]</w:t>
       </w:r>
       <w:r>
-        <w:t xml:space="preserve">. Conventional RAG pipelines enforce an invariant retrieval budget, extracting an identical quantity (</w:t>
+        <w:t xml:space="preserve">. Standard retrieval pipelines traditionally retrieve a predetermined, uniform passage count (</w:t>
       </w:r>
       <m:oMath>
         <m:r>
@@ -653,19 +617,19 @@
         </m:r>
       </m:oMath>
       <w:r>
-        <w:t xml:space="preserve">) of candidate passages for every query without regard to task complexity or source ambiguity </w:t>
+        <w:t xml:space="preserve">) regardless of query difficulty </w:t>
       </w:r>
       <w:r>
         <w:t xml:space="preserve">[3], [4]</w:t>
       </w:r>
       <w:r>
-        <w:t xml:space="preserve">. In multi-hop question answering, where deducing a correct resolution requires chaining disconnected evidence spans distributed across distinct documents </w:t>
+        <w:t xml:space="preserve">. Such rigid allocation creates severe bottlenecks in multi-hop reasoning, which requires assembling scattered premises across non-contiguous documents </w:t>
       </w:r>
       <w:r>
         <w:t xml:space="preserve">[5]</w:t>
       </w:r>
       <w:r>
-        <w:t xml:space="preserve">, static context limits induce an acute tension. Small values of</w:t>
+        <w:t xml:space="preserve">. When</w:t>
       </w:r>
       <w:r>
         <w:t xml:space="preserve"> </w:t>
@@ -679,7 +643,21 @@
         <w:t xml:space="preserve"> </w:t>
       </w:r>
       <w:r>
-        <w:t xml:space="preserve">risk omitting vital bridging assertions (under-retrieval), whereas aggressive context expansion introduces distracting irrelevancies that degrade generator attention while inflating inference compute (over-retrieval).</w:t>
+        <w:t xml:space="preserve">is small, critical bridging facts are missed; when</w:t>
+      </w:r>
+      <w:r>
+        <w:t xml:space="preserve"> </w:t>
+      </w:r>
+      <m:oMath>
+        <m:r>
+          <m:t>k</m:t>
+        </m:r>
+      </m:oMath>
+      <w:r>
+        <w:t xml:space="preserve"> </w:t>
+      </w:r>
+      <w:r>
+        <w:t xml:space="preserve">is large, unhelpful text fragments crowd the prompt, introducing noise and increasing inference latency.</w:t>
       </w:r>
     </w:p>
     <w:p>
@@ -687,25 +665,25 @@
         <w:pStyle w:val="BodyText"/>
       </w:pPr>
       <w:r>
-        <w:t xml:space="preserve">To circumvent this rigid dilemma, an emerging body of research explores dynamic mechanisms capable of regulating context acquisition on the fly </w:t>
+        <w:t xml:space="preserve">To address this trade-off, recent investigations propose dynamic stopping controllers that adjust retrieval volume per instance </w:t>
       </w:r>
       <w:r>
         <w:t xml:space="preserve">[3], [4], [6], [7]</w:t>
       </w:r>
       <w:r>
-        <w:t xml:space="preserve">. A standard strategy employs confidence-governed gating, retaining only candidate text passages whose relevance estimates exceed a predefined decision threshold </w:t>
+        <w:t xml:space="preserve">. Common implementations filter passages by thresholding retriever confidence scores </w:t>
       </w:r>
       <w:r>
         <w:t xml:space="preserve">[1]</w:t>
       </w:r>
       <w:r>
-        <w:t xml:space="preserve">. Nonetheless, deep transformer architectures and cross-encoder re-rankers are notoriously miscalibrated, often exhibiting substantial probability overconfidence </w:t>
+        <w:t xml:space="preserve">. However, modern deep neural classifiers—including dense cross-encoders—routinely exhibit miscalibration, assigning inflated confidence to erroneous predictions </w:t>
       </w:r>
       <w:r>
         <w:t xml:space="preserve">[8]</w:t>
       </w:r>
       <w:r>
-        <w:t xml:space="preserve">. Because raw logit outputs cannot be interpreted as well-behaved posterior probabilities of relevance, heuristic thresholding rules remain brittle and vulnerable to distributional divergence between query categories.</w:t>
+        <w:t xml:space="preserve">. Because unnormalized model logits fail to reflect true posterior relevance probabilities, heuristic score cutoffs behave unpredictably across diverse reasoning types.</w:t>
       </w:r>
     </w:p>
     <w:p>
@@ -713,7 +691,13 @@
         <w:pStyle w:val="BodyText"/>
       </w:pPr>
       <w:r>
-        <w:t xml:space="preserve">In this work, we conduct a comprehensive empirical appraisal examining the joint behavior of post-hoc probability recalibration, hop-conditioned query reformulation, and adaptive-</w:t>
+        <w:t xml:space="preserve">Here, we systematically evaluate how post-hoc probability scaling, sequential query expansion, and adaptive context truncation interact within multi-hop environments. Benchmarking six pipeline variants across 2,640 HotpotQA queries </w:t>
+      </w:r>
+      <w:r>
+        <w:t xml:space="preserve">[5]</w:t>
+      </w:r>
+      <w:r>
+        <w:t xml:space="preserve">, we uncover a recurring methodological pitfall: varying a stopping criterion alters both accuracy and the realized context volume (</w:t>
       </w:r>
       <m:oMath>
         <m:r>
@@ -721,39 +705,148 @@
         </m:r>
       </m:oMath>
       <w:r>
-        <w:t xml:space="preserve"> </w:t>
-      </w:r>
-      <w:r>
-        <w:t xml:space="preserve">stopping criteria within multi-hop RAG. We analyze six retrieval mechanisms on HotpotQA </w:t>
-      </w:r>
-      <w:r>
-        <w:t xml:space="preserve">[5]</w:t>
-      </w:r>
-      <w:r>
-        <w:t xml:space="preserve">, scaling evaluation from an initial calibration partition to an extensive pooled sample of</w:t>
-      </w:r>
-      <w:r>
-        <w:t xml:space="preserve"> </w:t>
-      </w:r>
-      <m:oMath>
-        <m:r>
-          <m:t>N</m:t>
-        </m:r>
-        <m:r>
-          <m:rPr>
-            <m:sty m:val="p"/>
-          </m:rPr>
-          <m:t>=</m:t>
-        </m:r>
-        <m:r>
-          <m:t>2640</m:t>
-        </m:r>
-      </m:oMath>
-      <w:r>
-        <w:t xml:space="preserve"> </w:t>
-      </w:r>
-      <w:r>
-        <w:t xml:space="preserve">question–document instances.</w:t>
+        <w:t xml:space="preserve">). Consequently, naive comparisons can misattribute gains from larger context windows to smarter selection algorithms. To eliminate this confound, we enforce matched-budget benchmarking centered at</w:t>
+      </w:r>
+      <w:r>
+        <w:t xml:space="preserve"> </w:t>
+      </w:r>
+      <m:oMath>
+        <m:r>
+          <m:t>k</m:t>
+        </m:r>
+        <m:r>
+          <m:rPr>
+            <m:sty m:val="p"/>
+          </m:rPr>
+          <m:t>=</m:t>
+        </m:r>
+        <m:r>
+          <m:t>4.00</m:t>
+        </m:r>
+      </m:oMath>
+      <w:r>
+        <w:t xml:space="preserve">, paired with exploratory non-parametric bootstrap evaluations (</w:t>
+      </w:r>
+      <m:oMath>
+        <m:r>
+          <m:t>B</m:t>
+        </m:r>
+        <m:r>
+          <m:rPr>
+            <m:sty m:val="p"/>
+          </m:rPr>
+          <m:t>=</m:t>
+        </m:r>
+        <m:r>
+          <m:t>10</m:t>
+        </m:r>
+        <m:r>
+          <m:rPr>
+            <m:sty m:val="p"/>
+          </m:rPr>
+          <m:t>,</m:t>
+        </m:r>
+        <m:r>
+          <m:t>000</m:t>
+        </m:r>
+      </m:oMath>
+      <w:r>
+        <w:t xml:space="preserve">) across an 8-point grid</w:t>
+      </w:r>
+      <w:r>
+        <w:t xml:space="preserve"> </w:t>
+      </w:r>
+      <m:oMath>
+        <m:r>
+          <m:t>k</m:t>
+        </m:r>
+        <m:r>
+          <m:rPr>
+            <m:sty m:val="p"/>
+          </m:rPr>
+          <m:t>∈</m:t>
+        </m:r>
+        <m:r>
+          <m:rPr>
+            <m:sty m:val="p"/>
+          </m:rPr>
+          <m:t>{</m:t>
+        </m:r>
+        <m:r>
+          <m:t>2.0</m:t>
+        </m:r>
+        <m:r>
+          <m:rPr>
+            <m:sty m:val="p"/>
+          </m:rPr>
+          <m:t>,</m:t>
+        </m:r>
+        <m:r>
+          <m:t>2.5</m:t>
+        </m:r>
+        <m:r>
+          <m:rPr>
+            <m:sty m:val="p"/>
+          </m:rPr>
+          <m:t>,</m:t>
+        </m:r>
+        <m:r>
+          <m:t>3.0</m:t>
+        </m:r>
+        <m:r>
+          <m:rPr>
+            <m:sty m:val="p"/>
+          </m:rPr>
+          <m:t>,</m:t>
+        </m:r>
+        <m:r>
+          <m:t>3.5</m:t>
+        </m:r>
+        <m:r>
+          <m:rPr>
+            <m:sty m:val="p"/>
+          </m:rPr>
+          <m:t>,</m:t>
+        </m:r>
+        <m:r>
+          <m:t>4.0</m:t>
+        </m:r>
+        <m:r>
+          <m:rPr>
+            <m:sty m:val="p"/>
+          </m:rPr>
+          <m:t>,</m:t>
+        </m:r>
+        <m:r>
+          <m:t>4.5</m:t>
+        </m:r>
+        <m:r>
+          <m:rPr>
+            <m:sty m:val="p"/>
+          </m:rPr>
+          <m:t>,</m:t>
+        </m:r>
+        <m:r>
+          <m:t>5.0</m:t>
+        </m:r>
+        <m:r>
+          <m:rPr>
+            <m:sty m:val="p"/>
+          </m:rPr>
+          <m:t>,</m:t>
+        </m:r>
+        <m:r>
+          <m:t>5.5</m:t>
+        </m:r>
+        <m:r>
+          <m:rPr>
+            <m:sty m:val="p"/>
+          </m:rPr>
+          <m:t>}</m:t>
+        </m:r>
+      </m:oMath>
+      <w:r>
+        <w:t xml:space="preserve">.</w:t>
       </w:r>
     </w:p>
     <w:p>
@@ -761,141 +854,7 @@
         <w:pStyle w:val="BodyText"/>
       </w:pPr>
       <w:r>
-        <w:t xml:space="preserve">Crucially, adaptive stopping rules inevitably alter the average context budget (</w:t>
-      </w:r>
-      <m:oMath>
-        <m:r>
-          <m:t>k</m:t>
-        </m:r>
-      </m:oMath>
-      <w:r>
-        <w:t xml:space="preserve">) alongside retrieval recall, meaning uncalibrated comparisons easily confound algorithmic selection capability with the statistical advantage of inspecting more text. To isolate genuine algorithmic performance from raw passage volume, our evaluation enforces rigorous matched-depth benchmarking fixed at reference depth</w:t>
-      </w:r>
-      <w:r>
-        <w:t xml:space="preserve"> </w:t>
-      </w:r>
-      <m:oMath>
-        <m:r>
-          <m:t>k</m:t>
-        </m:r>
-        <m:r>
-          <m:rPr>
-            <m:sty m:val="p"/>
-          </m:rPr>
-          <m:t>=</m:t>
-        </m:r>
-        <m:r>
-          <m:t>4.00</m:t>
-        </m:r>
-      </m:oMath>
-      <w:r>
-        <w:t xml:space="preserve">, complemented by an exploratory evaluation over target depths</w:t>
-      </w:r>
-      <w:r>
-        <w:t xml:space="preserve"> </w:t>
-      </w:r>
-      <m:oMath>
-        <m:r>
-          <m:t>k</m:t>
-        </m:r>
-        <m:r>
-          <m:rPr>
-            <m:sty m:val="p"/>
-          </m:rPr>
-          <m:t>∈</m:t>
-        </m:r>
-        <m:r>
-          <m:rPr>
-            <m:sty m:val="p"/>
-          </m:rPr>
-          <m:t>{</m:t>
-        </m:r>
-        <m:r>
-          <m:t>2.0</m:t>
-        </m:r>
-        <m:r>
-          <m:rPr>
-            <m:sty m:val="p"/>
-          </m:rPr>
-          <m:t>,</m:t>
-        </m:r>
-        <m:r>
-          <m:t>2.5</m:t>
-        </m:r>
-        <m:r>
-          <m:rPr>
-            <m:sty m:val="p"/>
-          </m:rPr>
-          <m:t>,</m:t>
-        </m:r>
-        <m:r>
-          <m:t>3.0</m:t>
-        </m:r>
-        <m:r>
-          <m:rPr>
-            <m:sty m:val="p"/>
-          </m:rPr>
-          <m:t>,</m:t>
-        </m:r>
-        <m:r>
-          <m:t>3.5</m:t>
-        </m:r>
-        <m:r>
-          <m:rPr>
-            <m:sty m:val="p"/>
-          </m:rPr>
-          <m:t>,</m:t>
-        </m:r>
-        <m:r>
-          <m:t>4.0</m:t>
-        </m:r>
-        <m:r>
-          <m:rPr>
-            <m:sty m:val="p"/>
-          </m:rPr>
-          <m:t>,</m:t>
-        </m:r>
-        <m:r>
-          <m:t>4.5</m:t>
-        </m:r>
-        <m:r>
-          <m:rPr>
-            <m:sty m:val="p"/>
-          </m:rPr>
-          <m:t>,</m:t>
-        </m:r>
-        <m:r>
-          <m:t>5.0</m:t>
-        </m:r>
-        <m:r>
-          <m:rPr>
-            <m:sty m:val="p"/>
-          </m:rPr>
-          <m:t>,</m:t>
-        </m:r>
-        <m:r>
-          <m:t>5.5</m:t>
-        </m:r>
-        <m:r>
-          <m:rPr>
-            <m:sty m:val="p"/>
-          </m:rPr>
-          <m:t>}</m:t>
-        </m:r>
-      </m:oMath>
-      <w:r>
-        <w:t xml:space="preserve"> </w:t>
-      </w:r>
-      <w:r>
-        <w:t xml:space="preserve">using 10,000 paired bootstrap resamples.</w:t>
-      </w:r>
-    </w:p>
-    <w:p>
-      <w:pPr>
-        <w:pStyle w:val="BodyText"/>
-      </w:pPr>
-      <w:r>
-        <w:t xml:space="preserve">Our primary empirical findings are:</w:t>
+        <w:t xml:space="preserve">Our principal empirical conclusions include:</w:t>
       </w:r>
     </w:p>
     <w:p>
@@ -911,13 +870,13 @@
           <w:b/>
           <w:bCs/>
         </w:rPr>
-        <w:t xml:space="preserve">Calibration Quality:</w:t>
-      </w:r>
-      <w:r>
-        <w:t xml:space="preserve"> </w:t>
-      </w:r>
-      <w:r>
-        <w:t xml:space="preserve">Raw cross-encoder relevance logits exhibit substantial miscalibration on the held-out</w:t>
+        <w:t xml:space="preserve">Calibration Fidelity:</w:t>
+      </w:r>
+      <w:r>
+        <w:t xml:space="preserve"> </w:t>
+      </w:r>
+      <w:r>
+        <w:t xml:space="preserve">Uncalibrated cross-encoder logits show pronounced probability distortion on the held-out</w:t>
       </w:r>
       <w:r>
         <w:t xml:space="preserve"> </w:t>
@@ -940,7 +899,7 @@
         <w:t xml:space="preserve"> </w:t>
       </w:r>
       <w:r>
-        <w:t xml:space="preserve">evaluation split (</w:t>
+        <w:t xml:space="preserve">split (</w:t>
       </w:r>
       <m:oMath>
         <m:r>
@@ -995,7 +954,7 @@
         <w:t xml:space="preserve"> </w:t>
       </w:r>
       <w:r>
-        <w:t xml:space="preserve">pool). Chunk-level Platt scaling </w:t>
+        <w:t xml:space="preserve">pool). Parametric Platt scaling </w:t>
       </w:r>
       <w:r>
         <w:t xml:space="preserve">[9]</w:t>
@@ -1004,7 +963,7 @@
         <w:t xml:space="preserve"> </w:t>
       </w:r>
       <w:r>
-        <w:t xml:space="preserve">reduces ECE by 82.6% to</w:t>
+        <w:t xml:space="preserve">curtails ECE by 82.6% to</w:t>
       </w:r>
       <w:r>
         <w:t xml:space="preserve"> </w:t>
@@ -1045,7 +1004,7 @@
           <w:b/>
           <w:bCs/>
         </w:rPr>
-        <w:t xml:space="preserve">Limits of Calibrated Gating at</w:t>
+        <w:t xml:space="preserve">Calibrated Gating Boundaries at</w:t>
       </w:r>
       <w:r>
         <w:rPr>
@@ -1569,7 +1528,7 @@
           <w:b/>
           <w:bCs/>
         </w:rPr>
-        <w:t xml:space="preserve">Asymmetric Multi-Hop Reformulation:</w:t>
+        <w:t xml:space="preserve">Structural Asymmetry in Query Expansion:</w:t>
       </w:r>
       <w:r>
         <w:t xml:space="preserve"> </w:t>
@@ -1858,7 +1817,7 @@
         </m:r>
       </m:oMath>
       <w:r>
-        <w:t xml:space="preserve">).</w:t>
+        <w:t xml:space="preserve">), where concatenated text induces apparent query drift.</w:t>
       </w:r>
     </w:p>
     <w:p>
@@ -1874,7 +1833,7 @@
           <w:b/>
           <w:bCs/>
         </w:rPr>
-        <w:t xml:space="preserve">Depth-Dependent Trajectories and Sufficiency Stopping:</w:t>
+        <w:t xml:space="preserve">Multi-Depth Dynamics and Sufficiency Halting:</w:t>
       </w:r>
       <w:r>
         <w:t xml:space="preserve"> </w:t>
@@ -2438,13 +2397,13 @@
         <w:t xml:space="preserve">Related Work</w:t>
       </w:r>
     </w:p>
-    <w:bookmarkStart w:id="10" w:name="_b4d1af2ddf93d453bd32d82b6548d0f28c27623"/>
+    <w:bookmarkStart w:id="10" w:name="_2df9154ed2a06f254ee5f081fedfa541bf6d82c"/>
     <w:p>
       <w:pPr>
         <w:pStyle w:val="Heading2"/>
       </w:pPr>
       <w:r>
-        <w:t xml:space="preserve">Context-Aware and Re-Ranked RAG</w:t>
+        <w:t xml:space="preserve">Context Validation and Re-Ranking</w:t>
       </w:r>
     </w:p>
     <w:p>
@@ -2452,7 +2411,7 @@
         <w:pStyle w:val="FirstParagraph"/>
       </w:pPr>
       <w:r>
-        <w:t xml:space="preserve">Traditional dense passage retrieval systems rely upon dual-encoder architectures that project queries and candidate documents into vector representations asynchronously, facilitating rapid sub-linear search while forfeiting fine-grained token-level cross-attention. Incorporating cross-encoder re-ranking stages substantially sharpens precision by computing bidirectional cross-attention over fused query–document sequences. Collini et al. </w:t>
+        <w:t xml:space="preserve">Standard dense search employs dual-encoder networks that map queries and texts into embedding spaces independently. While enabling rapid approximate nearest-neighbor lookups, dual encoders lack token-level cross-interaction. Second-stage cross-encoders address this limitation by executing full cross-attention over concatenated query–passage pairs, substantially boosting precision. Context-Aware RAG (CA-RAG) </w:t>
       </w:r>
       <w:r>
         <w:t xml:space="preserve">[1]</w:t>
@@ -2461,17 +2420,17 @@
         <w:t xml:space="preserve"> </w:t>
       </w:r>
       <w:r>
-        <w:t xml:space="preserve">formulated Context-Aware RAG (CA-RAG), showing that pruning semantic incongruities through similarity validation enhances downstream factual alignment. Within our evaluation taxonomy, Arm 1 serves as a CA-RAG-aligned dense bi-encoder benchmark, upon which we systematically contrast cross-encoder re-ranking, parametric calibration, and multi-hop gating policies.</w:t>
+        <w:t xml:space="preserve">introduced semantic consistency filtering to suppress irrelevant context and prevent generation anomalies. In our experimental setup, Arm 1 replicates this CA-RAG dual-encoder baseline, against which we systematically benchmark full cross-attention scoring, probability recalibration, and dynamic multi-step stopping.</w:t>
       </w:r>
     </w:p>
     <w:bookmarkEnd w:id="10"/>
-    <w:bookmarkStart w:id="11" w:name="_73c4ee860a2462bb3c52cfe470c8fd91da59899"/>
+    <w:bookmarkStart w:id="11" w:name="_516ac9110deb3711bb21665b32169c5481662ef"/>
     <w:p>
       <w:pPr>
         <w:pStyle w:val="Heading2"/>
       </w:pPr>
       <w:r>
-        <w:t xml:space="preserve">Adaptive and Dynamic Retrieval</w:t>
+        <w:t xml:space="preserve">Dynamic Retrieval Horizontally and Vertically</w:t>
       </w:r>
     </w:p>
     <w:p>
@@ -2479,7 +2438,7 @@
         <w:pStyle w:val="FirstParagraph"/>
       </w:pPr>
       <w:r>
-        <w:t xml:space="preserve">Adaptive retrieval paradigms modulate the frequency or depth of corpus interaction according to query-specific indicators. Kratzwald and Feuerriegel </w:t>
+        <w:t xml:space="preserve">Dynamic RAG frameworks adjust lookup behavior based on query traits. Prior studies investigate varying retrieval scope per query: Kratzwald and Feuerriegel </w:t>
       </w:r>
       <w:r>
         <w:t xml:space="preserve">[3]</w:t>
@@ -2488,7 +2447,7 @@
         <w:t xml:space="preserve"> </w:t>
       </w:r>
       <w:r>
-        <w:t xml:space="preserve">explored query-adaptive retrieval horizons for complex question answering pipelines. Adaptive-RAG </w:t>
+        <w:t xml:space="preserve">explored adaptive search depths for open-domain QA, while Adaptive-RAG </w:t>
       </w:r>
       <w:r>
         <w:t xml:space="preserve">[4]</w:t>
@@ -2497,7 +2456,7 @@
         <w:t xml:space="preserve"> </w:t>
       </w:r>
       <w:r>
-        <w:t xml:space="preserve">dynamically steers requests across non-retrieval, single-step, or iterative pathways utilizing a dedicated query difficulty classifier. Training-free gating strategies, exemplified by TARG </w:t>
+        <w:t xml:space="preserve">routes queries into zero-, single-, or multi-step execution paths via a dedicated complexity predictor. Training-free alternatives like TARG </w:t>
       </w:r>
       <w:r>
         <w:t xml:space="preserve">[6]</w:t>
@@ -2506,7 +2465,7 @@
         <w:t xml:space="preserve"> </w:t>
       </w:r>
       <w:r>
-        <w:t xml:space="preserve">(which decides retrieval necessity via draft-token entropy and logit margin) and CtrlA </w:t>
+        <w:t xml:space="preserve">(leveraging speculative draft entropy) and CtrlA </w:t>
       </w:r>
       <w:r>
         <w:t xml:space="preserve">[7]</w:t>
@@ -2515,7 +2474,7 @@
         <w:t xml:space="preserve"> </w:t>
       </w:r>
       <w:r>
-        <w:t xml:space="preserve">(which steers retrieval through honesty and confidence directions in LLM internal representations), evaluate when context lookup is justified. For extended generative synthesis, proactive architectures such as FLARE </w:t>
+        <w:t xml:space="preserve">(probing model internal activation directions) determine whether external context is required. During long-form generation, active systems such as FLARE </w:t>
       </w:r>
       <w:r>
         <w:t xml:space="preserve">[10]</w:t>
@@ -2536,7 +2495,7 @@
         <w:t xml:space="preserve"> </w:t>
       </w:r>
       <w:r>
-        <w:t xml:space="preserve">activate retrieval when internal token certainty drops below specified thresholds. Nevertheless, existing frameworks predominantly emphasize the binary trigger of retrieval rather than resolving the optimal passage count (</w:t>
+        <w:t xml:space="preserve">trigger retrieval whenever token-level uncertainty spikes. However, existing work predominantly targets the binary choice of whether to retrieve, leaving the question of optimal passage budget (</w:t>
       </w:r>
       <m:oMath>
         <m:r>
@@ -2544,17 +2503,17 @@
         </m:r>
       </m:oMath>
       <w:r>
-        <w:t xml:space="preserve">) under strict matched-depth controls.</w:t>
+        <w:t xml:space="preserve">) under strictly controlled depth budgets underexplored.</w:t>
       </w:r>
     </w:p>
     <w:bookmarkEnd w:id="11"/>
-    <w:bookmarkStart w:id="12" w:name="_3eef493d189e9d854e99a651ebf4bbe74623525"/>
+    <w:bookmarkStart w:id="12" w:name="_6fd563d4acecca63de7d6a8e3bcbecb6e910d8e"/>
     <w:p>
       <w:pPr>
         <w:pStyle w:val="Heading2"/>
       </w:pPr>
       <w:r>
-        <w:t xml:space="preserve">Confidence Calibration in Neural Systems</w:t>
+        <w:t xml:space="preserve">Confidence Calibration in Pretrained Models</w:t>
       </w:r>
     </w:p>
     <w:p>
@@ -2562,32 +2521,32 @@
         <w:pStyle w:val="FirstParagraph"/>
       </w:pPr>
       <w:r>
-        <w:t xml:space="preserve">Guo et al. </w:t>
+        <w:t xml:space="preserve">Deep neural networks notoriously produce uncalibrated confidence estimates that deviate from actual accuracy </w:t>
       </w:r>
       <w:r>
         <w:t xml:space="preserve">[8]</w:t>
       </w:r>
       <w:r>
-        <w:t xml:space="preserve"> </w:t>
-      </w:r>
-      <w:r>
-        <w:t xml:space="preserve">established that deep neural models systematically output overconfident probability estimates that misstate true empirical correctness. Post-processing recalibration techniques, notably temperature scaling and Platt scaling </w:t>
+        <w:t xml:space="preserve">. Post-hoc recalibration schemes, including Platt scaling </w:t>
       </w:r>
       <w:r>
         <w:t xml:space="preserve">[9]</w:t>
       </w:r>
       <w:r>
-        <w:t xml:space="preserve">, optimize parametric functions over held-out calibration partitions to transform uncalibrated raw scores into faithful posterior probabilities. In this paper, we examine whether recalibrating cross-encoder relevance logits can provide dependable stopping boundaries during multi-hop document retrieval.</w:t>
+        <w:t xml:space="preserve"> </w:t>
+      </w:r>
+      <w:r>
+        <w:t xml:space="preserve">and temperature scaling, parameterize monotonic transformations on calibration subsets to align raw logits with empirical correctness. In this study, we ask whether such recalibrated scores provide effective, trustworthy termination thresholds for multi-hop retrieval.</w:t>
       </w:r>
     </w:p>
     <w:bookmarkEnd w:id="12"/>
-    <w:bookmarkStart w:id="13" w:name="_4676f10dfe23c2ad2d01cb99461ab7f1b197861"/>
+    <w:bookmarkStart w:id="13" w:name="_77c5c40fc41efc414bd6f4e755bb691caf19aff"/>
     <w:p>
       <w:pPr>
         <w:pStyle w:val="Heading2"/>
       </w:pPr>
       <w:r>
-        <w:t xml:space="preserve">Multi-Hop Retrieval Architectures</w:t>
+        <w:t xml:space="preserve">Multi-Hop Retrieval Pipelines</w:t>
       </w:r>
     </w:p>
     <w:p>
@@ -2595,7 +2554,7 @@
         <w:pStyle w:val="FirstParagraph"/>
       </w:pPr>
       <w:r>
-        <w:t xml:space="preserve">Multi-hop question answering necessitates tracing multi-step reasoning trajectories across disjoint passages. Architectures such as Multi-hop Dense Retrieval (MDR) </w:t>
+        <w:t xml:space="preserve">Resolving multi-step questions requires following interconnected entity paths spanning separate text blocks. Dedicated architectures like Multi-hop Dense Retrieval (MDR) </w:t>
       </w:r>
       <w:r>
         <w:t xml:space="preserve">[12]</w:t>
@@ -2613,7 +2572,7 @@
         <w:t xml:space="preserve"> </w:t>
       </w:r>
       <w:r>
-        <w:t xml:space="preserve">train specialized multi-hop encoders to navigate dense document networks. Synergistic approaches like IRCoT </w:t>
+        <w:t xml:space="preserve">train specialized multi-step encoders to traverse document topologies. Similarly, IRCoT </w:t>
       </w:r>
       <w:r>
         <w:t xml:space="preserve">[14]</w:t>
@@ -2622,7 +2581,7 @@
         <w:t xml:space="preserve"> </w:t>
       </w:r>
       <w:r>
-        <w:t xml:space="preserve">alternate chain-of-thought token generation with intermediate retrieval steps. Rather than training specialized multi-hop representations from scratch, our work evaluates whether post-hoc probability calibration and confidence-based halting can effectively manage retrieval depth using widely deployed, off-the-shelf bi-encoders and cross-encoders.</w:t>
+        <w:t xml:space="preserve">interleaves chain-of-thought prompting with iterative passage collection. In contrast to training bespoke multi-hop encoders, our study tests whether post-hoc confidence calibration and iterative halting can regulate retrieval depth using standard, off-the-shelf retrieval models.</w:t>
       </w:r>
     </w:p>
     <w:bookmarkEnd w:id="13"/>

</xml_diff>

<commit_message>
Remove Author Contributions section
</commit_message>
<xml_diff>
--- a/ECA-RAG_final.docx
+++ b/ECA-RAG_final.docx
@@ -16690,66 +16690,6 @@
       </w:r>
       <w:r>
         <w:t xml:space="preserve">The authors received no external funding and declare no competing interests.</w:t>
-      </w:r>
-    </w:p>
-    <w:p>
-      <w:pPr>
-        <w:pStyle w:val="BodyText"/>
-      </w:pPr>
-      <w:r>
-        <w:rPr>
-          <w:b/>
-          <w:bCs/>
-        </w:rPr>
-        <w:t xml:space="preserve">Author Contributions:</w:t>
-      </w:r>
-      <w:r>
-        <w:t xml:space="preserve"> </w:t>
-      </w:r>
-      <w:r>
-        <w:rPr>
-          <w:b/>
-          <w:bCs/>
-        </w:rPr>
-        <w:t xml:space="preserve">J. A. Sugumar:</w:t>
-      </w:r>
-      <w:r>
-        <w:t xml:space="preserve"> </w:t>
-      </w:r>
-      <w:r>
-        <w:t xml:space="preserve">Conceptualization, Methodology, Software, Formal analysis.</w:t>
-      </w:r>
-      <w:r>
-        <w:t xml:space="preserve"> </w:t>
-      </w:r>
-      <w:r>
-        <w:rPr>
-          <w:b/>
-          <w:bCs/>
-        </w:rPr>
-        <w:t xml:space="preserve">A. Kumar:</w:t>
-      </w:r>
-      <w:r>
-        <w:t xml:space="preserve"> </w:t>
-      </w:r>
-      <w:r>
-        <w:t xml:space="preserve">Investigation, Data curation, Validation, Visualization.</w:t>
-      </w:r>
-      <w:r>
-        <w:t xml:space="preserve"> </w:t>
-      </w:r>
-      <w:r>
-        <w:rPr>
-          <w:b/>
-          <w:bCs/>
-        </w:rPr>
-        <w:t xml:space="preserve">A. Murali:</w:t>
-      </w:r>
-      <w:r>
-        <w:t xml:space="preserve"> </w:t>
-      </w:r>
-      <w:r>
-        <w:t xml:space="preserve">Writing – original draft, Writing – review &amp; editing, Supervision, Project administration.</w:t>
       </w:r>
     </w:p>
     <w:bookmarkStart w:id="74" w:name="_refs"/>

</xml_diff>